<commit_message>
Updated Build guide and some STL files
</commit_message>
<xml_diff>
--- a/docs/build-guide/Planetary Bean Bouncer Build Guide.docx
+++ b/docs/build-guide/Planetary Bean Bouncer Build Guide.docx
@@ -198,19 +198,13 @@
         <w:t xml:space="preserve"> Tee Nuts and all the 3D printed parts are sized to use M5x12mm screws.  I use </w:t>
       </w:r>
       <w:r>
-        <w:t>18-8</w:t>
-      </w:r>
-      <w:r>
-        <w:t xml:space="preserve"> </w:t>
+        <w:t xml:space="preserve">18-8 </w:t>
       </w:r>
       <w:r>
         <w:t xml:space="preserve">stainless steel button head screws as I prefer them.  Anything outside the sifter does not need to be stainless though.  You might have less or more of these Tee Nuts depending on how you configure it.  </w:t>
       </w:r>
       <w:r>
-        <w:t>For instance, you will probably power the 12 V supply for the motor differently than I do</w:t>
-      </w:r>
-      <w:r>
-        <w:t xml:space="preserve"> </w:t>
+        <w:t xml:space="preserve">For instance, you will probably power the 12 V supply for the motor differently than I do </w:t>
       </w:r>
       <w:r>
         <w:t>or you might not want to bother with the planetary gear system.</w:t>
@@ -560,7 +554,13 @@
         <w:spacing w:line="240" w:lineRule="auto"/>
       </w:pPr>
       <w:r>
-        <w:t>Do the same for the opposite side using 4 more M5x12mm screws.</w:t>
+        <w:t>Do the same for</w:t>
+      </w:r>
+      <w:r>
+        <w:t xml:space="preserve"> the opposite side using 4-</w:t>
+      </w:r>
+      <w:r>
+        <w:t>M5x12mm screws.</w:t>
       </w:r>
     </w:p>
     <w:p>
@@ -730,7 +730,13 @@
     <w:p/>
     <w:p>
       <w:r>
-        <w:t>Turn frame right side up again and add 10 Tee Nuts as shown in green to the 2 – 2040x140mm length extrusions.  They do not need to be positioned correctly yet.</w:t>
+        <w:t>Turn frame right side up again and add 10 Tee Nu</w:t>
+      </w:r>
+      <w:r>
+        <w:t>ts as shown in green to the 2–</w:t>
+      </w:r>
+      <w:r>
+        <w:t>2040x140mm length extrusions.  They do not need to be positioned correctly yet.</w:t>
       </w:r>
     </w:p>
     <w:p>
@@ -783,7 +789,15 @@
     </w:p>
     <w:p>
       <w:r>
-        <w:t>Attach Bearing_Column_1 and Bearing_Column_2 to the end of the 2040x500mm top frames and the short 2040x140mm extrusion as shown.  Make sure you have a Tee Nut as shown in the middle of short 2040.  It does not have to be centered yet.  Use 8-M5x12mm screws with Tee Nuts in the extrusions to connect these.</w:t>
+        <w:t>Attach Bearing_Column_1 and Bearing_Column_2 to the end of the 2040x500mm top frames and the short 2040x140mm extrusion as shown.  Make sure you have a Tee Nut as shown in the middle of short 2040.  It does not have to be centered yet.  Use 8-</w:t>
+      </w:r>
+      <w:bookmarkStart w:id="0" w:name="_GoBack"/>
+      <w:r>
+        <w:t>M5x12mm</w:t>
+      </w:r>
+      <w:bookmarkEnd w:id="0"/>
+      <w:r>
+        <w:t xml:space="preserve"> screws with Tee Nuts in the extrusions to connect these.</w:t>
       </w:r>
     </w:p>
     <w:p>
@@ -910,21 +924,36 @@
       </w:r>
     </w:p>
     <w:p>
-      <w:r>
-        <w:t xml:space="preserve">We are just putting this </w:t>
+      <w:pPr>
+        <w:spacing w:line="240" w:lineRule="auto"/>
+      </w:pPr>
+      <w:r>
+        <w:t xml:space="preserve">Use the </w:t>
       </w:r>
       <w:proofErr w:type="spellStart"/>
       <w:r>
         <w:rPr>
           <w:b/>
         </w:rPr>
-        <w:t>BearingBar</w:t>
+        <w:t>Bearing_Height_Shim.stl</w:t>
       </w:r>
       <w:proofErr w:type="spellEnd"/>
       <w:r>
-        <w:t xml:space="preserve"> temporarily in place.  When you put the shaft through the flour sifter later, you will have to adjust this bar.</w:t>
-      </w:r>
-    </w:p>
+        <w:t xml:space="preserve"> to set the correct height for the </w:t>
+      </w:r>
+      <w:proofErr w:type="spellStart"/>
+      <w:r>
+        <w:rPr>
+          <w:b/>
+        </w:rPr>
+        <w:t>Bearingbar</w:t>
+      </w:r>
+      <w:proofErr w:type="spellEnd"/>
+      <w:r>
+        <w:t xml:space="preserve"> as shown below.</w:t>
+      </w:r>
+    </w:p>
+    <w:p/>
     <w:p>
       <w:r>
         <w:rPr>
@@ -932,7 +961,7 @@
         </w:rPr>
         <w:drawing>
           <wp:inline distT="0" distB="0" distL="0" distR="0" wp14:anchorId="6ECFB17D" wp14:editId="30D90DB5">
-            <wp:extent cx="3581400" cy="2686050"/>
+            <wp:extent cx="3302000" cy="2476500"/>
             <wp:effectExtent l="0" t="0" r="0" b="0"/>
             <wp:docPr id="4" name="Picture 4"/>
             <wp:cNvGraphicFramePr>
@@ -946,7 +975,7 @@
                     <pic:cNvPicPr/>
                   </pic:nvPicPr>
                   <pic:blipFill>
-                    <a:blip r:embed="rId16">
+                    <a:blip r:embed="rId16" cstate="print">
                       <a:extLst>
                         <a:ext uri="{28A0092B-C50C-407E-A947-70E740481C1C}">
                           <a14:useLocalDpi xmlns:a14="http://schemas.microsoft.com/office/drawing/2010/main" val="0"/>
@@ -960,7 +989,7 @@
                   <pic:spPr>
                     <a:xfrm>
                       <a:off x="0" y="0"/>
-                      <a:ext cx="3586184" cy="2689638"/>
+                      <a:ext cx="3306411" cy="2479808"/>
                     </a:xfrm>
                     <a:prstGeom prst="rect">
                       <a:avLst/>
@@ -972,6 +1001,58 @@
           </wp:inline>
         </w:drawing>
       </w:r>
+      <w:r>
+        <w:rPr>
+          <w:noProof/>
+        </w:rPr>
+        <w:t xml:space="preserve"> </w:t>
+      </w:r>
+      <w:r>
+        <w:rPr>
+          <w:noProof/>
+        </w:rPr>
+        <w:drawing>
+          <wp:inline distT="0" distB="0" distL="0" distR="0" wp14:anchorId="4B3FE07F" wp14:editId="6C944246">
+            <wp:extent cx="3305175" cy="2478881"/>
+            <wp:effectExtent l="0" t="0" r="0" b="0"/>
+            <wp:docPr id="24" name="Picture 24"/>
+            <wp:cNvGraphicFramePr>
+              <a:graphicFrameLocks xmlns:a="http://schemas.openxmlformats.org/drawingml/2006/main" noChangeAspect="1"/>
+            </wp:cNvGraphicFramePr>
+            <a:graphic xmlns:a="http://schemas.openxmlformats.org/drawingml/2006/main">
+              <a:graphicData uri="http://schemas.openxmlformats.org/drawingml/2006/picture">
+                <pic:pic xmlns:pic="http://schemas.openxmlformats.org/drawingml/2006/picture">
+                  <pic:nvPicPr>
+                    <pic:cNvPr id="0" name="Shim_BearingColumns.jpg"/>
+                    <pic:cNvPicPr/>
+                  </pic:nvPicPr>
+                  <pic:blipFill>
+                    <a:blip r:embed="rId17" cstate="print">
+                      <a:extLst>
+                        <a:ext uri="{28A0092B-C50C-407E-A947-70E740481C1C}">
+                          <a14:useLocalDpi xmlns:a14="http://schemas.microsoft.com/office/drawing/2010/main" val="0"/>
+                        </a:ext>
+                      </a:extLst>
+                    </a:blip>
+                    <a:stretch>
+                      <a:fillRect/>
+                    </a:stretch>
+                  </pic:blipFill>
+                  <pic:spPr>
+                    <a:xfrm>
+                      <a:off x="0" y="0"/>
+                      <a:ext cx="3308129" cy="2481096"/>
+                    </a:xfrm>
+                    <a:prstGeom prst="rect">
+                      <a:avLst/>
+                    </a:prstGeom>
+                  </pic:spPr>
+                </pic:pic>
+              </a:graphicData>
+            </a:graphic>
+          </wp:inline>
+        </w:drawing>
+      </w:r>
     </w:p>
     <w:p>
       <w:pPr>
@@ -987,7 +1068,13 @@
         <w:t>V2040x240_End_Plates</w:t>
       </w:r>
       <w:r>
-        <w:t xml:space="preserve"> to the other short 2040x140mm extrusion with 8 M5x12mm screws and Tee Nuts.  Make sure you have a Tee Nut in the extrusion as we did in the other short 2040x140mm.  Make sure it is in the correct groove as shown.</w:t>
+        <w:t xml:space="preserve"> to the other sh</w:t>
+      </w:r>
+      <w:r>
+        <w:t>ort 2040x140mm extrusion with 8-</w:t>
+      </w:r>
+      <w:r>
+        <w:t>M5x12mm screws and Tee Nuts.  Make sure you have a Tee Nut in the extrusion as we did in the other short 2040x140mm.  Make sure it is in the correct groove as shown.</w:t>
       </w:r>
     </w:p>
     <w:p>
@@ -1014,7 +1101,7 @@
                     <pic:cNvPicPr/>
                   </pic:nvPicPr>
                   <pic:blipFill>
-                    <a:blip r:embed="rId17">
+                    <a:blip r:embed="rId18">
                       <a:extLst>
                         <a:ext uri="{28A0092B-C50C-407E-A947-70E740481C1C}">
                           <a14:useLocalDpi xmlns:a14="http://schemas.microsoft.com/office/drawing/2010/main" val="0"/>
@@ -1050,7 +1137,7 @@
         <w:rPr>
           <w:b/>
         </w:rPr>
-        <w:t>ShortV_Connect_V2</w:t>
+        <w:t>ShortV_Connect_V3</w:t>
       </w:r>
       <w:r>
         <w:t xml:space="preserve"> before putting the end piece on.  This is used for connecting the Electronics case to the extrusion.</w:t>
@@ -1063,9 +1150,9 @@
         </w:rPr>
         <w:drawing>
           <wp:inline distT="0" distB="0" distL="0" distR="0">
-            <wp:extent cx="4943475" cy="3707606"/>
+            <wp:extent cx="4867275" cy="3650456"/>
             <wp:effectExtent l="0" t="0" r="0" b="7620"/>
-            <wp:docPr id="21" name="Picture 21"/>
+            <wp:docPr id="18" name="Picture 18"/>
             <wp:cNvGraphicFramePr>
               <a:graphicFrameLocks xmlns:a="http://schemas.openxmlformats.org/drawingml/2006/main" noChangeAspect="1"/>
             </wp:cNvGraphicFramePr>
@@ -1073,67 +1160,7 @@
               <a:graphicData uri="http://schemas.openxmlformats.org/drawingml/2006/picture">
                 <pic:pic xmlns:pic="http://schemas.openxmlformats.org/drawingml/2006/picture">
                   <pic:nvPicPr>
-                    <pic:cNvPr id="0" name="ShortV_Connect_V2.jpg"/>
-                    <pic:cNvPicPr/>
-                  </pic:nvPicPr>
-                  <pic:blipFill>
-                    <a:blip r:embed="rId18">
-                      <a:extLst>
-                        <a:ext uri="{28A0092B-C50C-407E-A947-70E740481C1C}">
-                          <a14:useLocalDpi xmlns:a14="http://schemas.microsoft.com/office/drawing/2010/main" val="0"/>
-                        </a:ext>
-                      </a:extLst>
-                    </a:blip>
-                    <a:stretch>
-                      <a:fillRect/>
-                    </a:stretch>
-                  </pic:blipFill>
-                  <pic:spPr>
-                    <a:xfrm>
-                      <a:off x="0" y="0"/>
-                      <a:ext cx="4943475" cy="3707606"/>
-                    </a:xfrm>
-                    <a:prstGeom prst="rect">
-                      <a:avLst/>
-                    </a:prstGeom>
-                  </pic:spPr>
-                </pic:pic>
-              </a:graphicData>
-            </a:graphic>
-          </wp:inline>
-        </w:drawing>
-      </w:r>
-    </w:p>
-    <w:p>
-      <w:r>
-        <w:t xml:space="preserve">The next part to install is the </w:t>
-      </w:r>
-      <w:r>
-        <w:rPr>
-          <w:b/>
-        </w:rPr>
-        <w:t>V2020x140_Mod</w:t>
-      </w:r>
-      <w:r>
-        <w:t xml:space="preserve"> 3D print.  You could also use a 2020x140mm length of extrusion, but this uses only 1 Tee Nut on each side and you do not have any grooves for chaff to get in.</w:t>
-      </w:r>
-      <w:r>
-        <w:rPr>
-          <w:noProof/>
-        </w:rPr>
-        <w:drawing>
-          <wp:inline distT="0" distB="0" distL="0" distR="0">
-            <wp:extent cx="4791075" cy="3593306"/>
-            <wp:effectExtent l="0" t="0" r="0" b="7620"/>
-            <wp:docPr id="22" name="Picture 22"/>
-            <wp:cNvGraphicFramePr>
-              <a:graphicFrameLocks xmlns:a="http://schemas.openxmlformats.org/drawingml/2006/main" noChangeAspect="1"/>
-            </wp:cNvGraphicFramePr>
-            <a:graphic xmlns:a="http://schemas.openxmlformats.org/drawingml/2006/main">
-              <a:graphicData uri="http://schemas.openxmlformats.org/drawingml/2006/picture">
-                <pic:pic xmlns:pic="http://schemas.openxmlformats.org/drawingml/2006/picture">
-                  <pic:nvPicPr>
-                    <pic:cNvPr id="0" name="V2020x140_Mod.jpg"/>
+                    <pic:cNvPr id="0" name="ShortV_Connect_V3.jpg"/>
                     <pic:cNvPicPr/>
                   </pic:nvPicPr>
                   <pic:blipFill>
@@ -1151,7 +1178,7 @@
                   <pic:spPr>
                     <a:xfrm>
                       <a:off x="0" y="0"/>
-                      <a:ext cx="4793996" cy="3595497"/>
+                      <a:ext cx="4867275" cy="3650456"/>
                     </a:xfrm>
                     <a:prstGeom prst="rect">
                       <a:avLst/>
@@ -1166,6 +1193,67 @@
     </w:p>
     <w:p>
       <w:r>
+        <w:t xml:space="preserve">The next part to install is the </w:t>
+      </w:r>
+      <w:r>
+        <w:rPr>
+          <w:b/>
+        </w:rPr>
+        <w:t>V2020x140_Mod</w:t>
+      </w:r>
+      <w:r>
+        <w:t xml:space="preserve"> 3D print.  You could also use a 2020x140mm length of extrusion, but this uses only 1 Tee Nut on each side and you do not have any grooves for chaff to get in.</w:t>
+      </w:r>
+      <w:r>
+        <w:rPr>
+          <w:noProof/>
+        </w:rPr>
+        <w:drawing>
+          <wp:inline distT="0" distB="0" distL="0" distR="0">
+            <wp:extent cx="5003800" cy="3752850"/>
+            <wp:effectExtent l="0" t="0" r="6350" b="0"/>
+            <wp:docPr id="20" name="Picture 20"/>
+            <wp:cNvGraphicFramePr>
+              <a:graphicFrameLocks xmlns:a="http://schemas.openxmlformats.org/drawingml/2006/main" noChangeAspect="1"/>
+            </wp:cNvGraphicFramePr>
+            <a:graphic xmlns:a="http://schemas.openxmlformats.org/drawingml/2006/main">
+              <a:graphicData uri="http://schemas.openxmlformats.org/drawingml/2006/picture">
+                <pic:pic xmlns:pic="http://schemas.openxmlformats.org/drawingml/2006/picture">
+                  <pic:nvPicPr>
+                    <pic:cNvPr id="0" name="V2020x140_Mod.jpg"/>
+                    <pic:cNvPicPr/>
+                  </pic:nvPicPr>
+                  <pic:blipFill>
+                    <a:blip r:embed="rId20">
+                      <a:extLst>
+                        <a:ext uri="{28A0092B-C50C-407E-A947-70E740481C1C}">
+                          <a14:useLocalDpi xmlns:a14="http://schemas.microsoft.com/office/drawing/2010/main" val="0"/>
+                        </a:ext>
+                      </a:extLst>
+                    </a:blip>
+                    <a:stretch>
+                      <a:fillRect/>
+                    </a:stretch>
+                  </pic:blipFill>
+                  <pic:spPr>
+                    <a:xfrm>
+                      <a:off x="0" y="0"/>
+                      <a:ext cx="5003800" cy="3752850"/>
+                    </a:xfrm>
+                    <a:prstGeom prst="rect">
+                      <a:avLst/>
+                    </a:prstGeom>
+                  </pic:spPr>
+                </pic:pic>
+              </a:graphicData>
+            </a:graphic>
+          </wp:inline>
+        </w:drawing>
+      </w:r>
+    </w:p>
+    <w:p>
+      <w:r>
+        <w:lastRenderedPageBreak/>
         <w:t>Except for putting the end caps on this completes the top frame construction.</w:t>
       </w:r>
       <w:r>
@@ -1186,7 +1274,6 @@
           <w:sz w:val="40"/>
           <w:szCs w:val="40"/>
         </w:rPr>
-        <w:lastRenderedPageBreak/>
         <w:t>Optional 5:1 Planetary Gear</w:t>
       </w:r>
     </w:p>
@@ -1510,6 +1597,7 @@
           <w:sz w:val="40"/>
           <w:szCs w:val="40"/>
         </w:rPr>
+        <w:lastRenderedPageBreak/>
         <w:drawing>
           <wp:inline distT="0" distB="0" distL="0" distR="0" wp14:anchorId="1747D436" wp14:editId="39A4D6A9">
             <wp:extent cx="5686425" cy="4264820"/>
@@ -1526,7 +1614,7 @@
                     <pic:cNvPicPr/>
                   </pic:nvPicPr>
                   <pic:blipFill>
-                    <a:blip r:embed="rId20">
+                    <a:blip r:embed="rId21">
                       <a:extLst>
                         <a:ext uri="{28A0092B-C50C-407E-A947-70E740481C1C}">
                           <a14:useLocalDpi xmlns:a14="http://schemas.microsoft.com/office/drawing/2010/main" val="0"/>
@@ -1712,10 +1800,7 @@
         <w:t xml:space="preserve"> on top of the bearings.  </w:t>
       </w:r>
       <w:r>
-        <w:t>The M5x30mm screws should protrude through the top.</w:t>
-      </w:r>
-      <w:r>
-        <w:t xml:space="preserve">  </w:t>
+        <w:t xml:space="preserve">The M5x30mm screws should protrude through the top.  </w:t>
       </w:r>
       <w:r>
         <w:rPr>
@@ -1897,7 +1982,6 @@
           <w:sz w:val="40"/>
           <w:szCs w:val="40"/>
         </w:rPr>
-        <w:lastRenderedPageBreak/>
         <w:t>Nema</w:t>
       </w:r>
       <w:proofErr w:type="spellEnd"/>
@@ -2101,6 +2185,7 @@
           <w:sz w:val="40"/>
           <w:szCs w:val="40"/>
         </w:rPr>
+        <w:lastRenderedPageBreak/>
         <w:drawing>
           <wp:inline distT="0" distB="0" distL="0" distR="0">
             <wp:extent cx="6438900" cy="4829175"/>
@@ -2117,7 +2202,7 @@
                     <pic:cNvPicPr/>
                   </pic:nvPicPr>
                   <pic:blipFill>
-                    <a:blip r:embed="rId21">
+                    <a:blip r:embed="rId22">
                       <a:extLst>
                         <a:ext uri="{28A0092B-C50C-407E-A947-70E740481C1C}">
                           <a14:useLocalDpi xmlns:a14="http://schemas.microsoft.com/office/drawing/2010/main" val="0"/>
@@ -2164,7 +2249,6 @@
           <w:sz w:val="40"/>
           <w:szCs w:val="40"/>
         </w:rPr>
-        <w:lastRenderedPageBreak/>
         <w:t>Wobble Disc Assembly</w:t>
       </w:r>
       <w:r>
@@ -2315,6 +2399,7 @@
           <w:sz w:val="24"/>
           <w:szCs w:val="24"/>
         </w:rPr>
+        <w:lastRenderedPageBreak/>
         <w:t xml:space="preserve">4 – Regular M5 </w:t>
       </w:r>
       <w:r>
@@ -2394,10 +2479,7 @@
         </w:rPr>
       </w:pPr>
       <w:r>
-        <w:t>Only the 2 external tooth lock washers, 2 hex nuts, and 2 serrated flange lock nuts are really necessary.</w:t>
-      </w:r>
-      <w:r>
-        <w:t xml:space="preserve">  </w:t>
+        <w:t xml:space="preserve">Only the 2 external tooth lock washers, 2 hex nuts, and 2 serrated flange lock nuts are really necessary.  </w:t>
       </w:r>
       <w:r>
         <w:rPr>
@@ -2406,8 +2488,6 @@
         </w:rPr>
         <w:t>I added the spacers with h</w:t>
       </w:r>
-      <w:bookmarkStart w:id="0" w:name="_GoBack"/>
-      <w:bookmarkEnd w:id="0"/>
       <w:r>
         <w:rPr>
           <w:sz w:val="24"/>
@@ -2460,7 +2540,7 @@
                     <pic:cNvPicPr/>
                   </pic:nvPicPr>
                   <pic:blipFill>
-                    <a:blip r:embed="rId22">
+                    <a:blip r:embed="rId23">
                       <a:extLst>
                         <a:ext uri="{28A0092B-C50C-407E-A947-70E740481C1C}">
                           <a14:useLocalDpi xmlns:a14="http://schemas.microsoft.com/office/drawing/2010/main" val="0"/>
@@ -2501,180 +2581,180 @@
           <w:sz w:val="40"/>
           <w:szCs w:val="40"/>
         </w:rPr>
+        <w:t>Mount Flour Sifter Assembly to Frame</w:t>
+      </w:r>
+    </w:p>
+    <w:p>
+      <w:pPr>
+        <w:rPr>
+          <w:b/>
+          <w:sz w:val="24"/>
+          <w:szCs w:val="24"/>
+        </w:rPr>
+      </w:pPr>
+      <w:r>
+        <w:rPr>
+          <w:b/>
+          <w:sz w:val="24"/>
+          <w:szCs w:val="24"/>
+        </w:rPr>
+        <w:t>Hardware:</w:t>
+      </w:r>
+    </w:p>
+    <w:p>
+      <w:pPr>
+        <w:spacing w:after="0" w:line="240" w:lineRule="auto"/>
+        <w:rPr>
+          <w:sz w:val="24"/>
+          <w:szCs w:val="24"/>
+        </w:rPr>
+      </w:pPr>
+      <w:r>
+        <w:rPr>
+          <w:sz w:val="24"/>
+          <w:szCs w:val="24"/>
+        </w:rPr>
+        <w:t>1 – Assembly from previous procedure</w:t>
+      </w:r>
+    </w:p>
+    <w:p>
+      <w:pPr>
+        <w:spacing w:after="0" w:line="240" w:lineRule="auto"/>
+        <w:rPr>
+          <w:sz w:val="24"/>
+          <w:szCs w:val="24"/>
+        </w:rPr>
+      </w:pPr>
+      <w:r>
+        <w:rPr>
+          <w:sz w:val="24"/>
+          <w:szCs w:val="24"/>
+        </w:rPr>
+        <w:t xml:space="preserve">1 - </w:t>
+      </w:r>
+      <w:r>
+        <w:rPr>
+          <w:sz w:val="24"/>
+          <w:szCs w:val="24"/>
+        </w:rPr>
+        <w:t>5"-7" SS Band Clamp</w:t>
+      </w:r>
+    </w:p>
+    <w:p>
+      <w:pPr>
+        <w:spacing w:after="0" w:line="240" w:lineRule="auto"/>
+        <w:rPr>
+          <w:sz w:val="24"/>
+          <w:szCs w:val="24"/>
+        </w:rPr>
+      </w:pPr>
+      <w:r>
+        <w:rPr>
+          <w:sz w:val="24"/>
+          <w:szCs w:val="24"/>
+        </w:rPr>
+        <w:t xml:space="preserve">4 – </w:t>
+      </w:r>
+      <w:r>
+        <w:rPr>
+          <w:sz w:val="24"/>
+          <w:szCs w:val="24"/>
+        </w:rPr>
+        <w:t>18x18x30 L Brackets</w:t>
+      </w:r>
+      <w:r>
+        <w:rPr>
+          <w:sz w:val="24"/>
+          <w:szCs w:val="24"/>
+        </w:rPr>
+        <w:t xml:space="preserve"> as shown in BOM</w:t>
+      </w:r>
+    </w:p>
+    <w:p>
+      <w:pPr>
+        <w:spacing w:after="0" w:line="240" w:lineRule="auto"/>
+        <w:rPr>
+          <w:sz w:val="24"/>
+          <w:szCs w:val="24"/>
+        </w:rPr>
+      </w:pPr>
+      <w:r>
+        <w:rPr>
+          <w:sz w:val="24"/>
+          <w:szCs w:val="24"/>
+        </w:rPr>
+        <w:t>4 – M5x12mm screws</w:t>
+      </w:r>
+    </w:p>
+    <w:p>
+      <w:pPr>
+        <w:spacing w:after="0" w:line="240" w:lineRule="auto"/>
+        <w:rPr>
+          <w:sz w:val="24"/>
+          <w:szCs w:val="24"/>
+        </w:rPr>
+      </w:pPr>
+      <w:r>
+        <w:rPr>
+          <w:sz w:val="24"/>
+          <w:szCs w:val="24"/>
+        </w:rPr>
+        <w:t>4 – Tee Nuts</w:t>
+      </w:r>
+    </w:p>
+    <w:p>
+      <w:pPr>
+        <w:spacing w:after="0" w:line="240" w:lineRule="auto"/>
+        <w:rPr>
+          <w:sz w:val="24"/>
+          <w:szCs w:val="24"/>
+        </w:rPr>
+      </w:pPr>
+      <w:r>
+        <w:rPr>
+          <w:sz w:val="24"/>
+          <w:szCs w:val="24"/>
+        </w:rPr>
+        <w:t xml:space="preserve">12 - </w:t>
+      </w:r>
+      <w:r>
+        <w:rPr>
+          <w:sz w:val="24"/>
+          <w:szCs w:val="24"/>
+        </w:rPr>
+        <w:t>M5 fender washers</w:t>
+      </w:r>
+      <w:r>
+        <w:rPr>
+          <w:sz w:val="24"/>
+          <w:szCs w:val="24"/>
+        </w:rPr>
+        <w:t xml:space="preserve"> as shown in BOM</w:t>
+      </w:r>
+    </w:p>
+    <w:p>
+      <w:pPr>
+        <w:spacing w:after="0" w:line="240" w:lineRule="auto"/>
+        <w:rPr>
+          <w:sz w:val="24"/>
+          <w:szCs w:val="24"/>
+        </w:rPr>
+      </w:pPr>
+    </w:p>
+    <w:p>
+      <w:pPr>
+        <w:spacing w:after="0" w:line="240" w:lineRule="auto"/>
+        <w:rPr>
+          <w:sz w:val="24"/>
+          <w:szCs w:val="24"/>
+        </w:rPr>
+      </w:pPr>
+      <w:r>
+        <w:rPr>
+          <w:sz w:val="24"/>
+          <w:szCs w:val="24"/>
+        </w:rPr>
         <w:lastRenderedPageBreak/>
-        <w:t>Mount Flour Sifter Assembly to Frame</w:t>
-      </w:r>
-    </w:p>
-    <w:p>
-      <w:pPr>
-        <w:rPr>
-          <w:b/>
-          <w:sz w:val="24"/>
-          <w:szCs w:val="24"/>
-        </w:rPr>
-      </w:pPr>
-      <w:r>
-        <w:rPr>
-          <w:b/>
-          <w:sz w:val="24"/>
-          <w:szCs w:val="24"/>
-        </w:rPr>
-        <w:t>Hardware:</w:t>
-      </w:r>
-    </w:p>
-    <w:p>
-      <w:pPr>
-        <w:spacing w:after="0" w:line="240" w:lineRule="auto"/>
-        <w:rPr>
-          <w:sz w:val="24"/>
-          <w:szCs w:val="24"/>
-        </w:rPr>
-      </w:pPr>
-      <w:r>
-        <w:rPr>
-          <w:sz w:val="24"/>
-          <w:szCs w:val="24"/>
-        </w:rPr>
-        <w:t>1 – Assembly from previous procedure</w:t>
-      </w:r>
-    </w:p>
-    <w:p>
-      <w:pPr>
-        <w:spacing w:after="0" w:line="240" w:lineRule="auto"/>
-        <w:rPr>
-          <w:sz w:val="24"/>
-          <w:szCs w:val="24"/>
-        </w:rPr>
-      </w:pPr>
-      <w:r>
-        <w:rPr>
-          <w:sz w:val="24"/>
-          <w:szCs w:val="24"/>
-        </w:rPr>
-        <w:t xml:space="preserve">1 - </w:t>
-      </w:r>
-      <w:r>
-        <w:rPr>
-          <w:sz w:val="24"/>
-          <w:szCs w:val="24"/>
-        </w:rPr>
-        <w:t>5"-7" SS Band Clamp</w:t>
-      </w:r>
-    </w:p>
-    <w:p>
-      <w:pPr>
-        <w:spacing w:after="0" w:line="240" w:lineRule="auto"/>
-        <w:rPr>
-          <w:sz w:val="24"/>
-          <w:szCs w:val="24"/>
-        </w:rPr>
-      </w:pPr>
-      <w:r>
-        <w:rPr>
-          <w:sz w:val="24"/>
-          <w:szCs w:val="24"/>
-        </w:rPr>
-        <w:t xml:space="preserve">4 – </w:t>
-      </w:r>
-      <w:r>
-        <w:rPr>
-          <w:sz w:val="24"/>
-          <w:szCs w:val="24"/>
-        </w:rPr>
-        <w:t>18x18x30 L Brackets</w:t>
-      </w:r>
-      <w:r>
-        <w:rPr>
-          <w:sz w:val="24"/>
-          <w:szCs w:val="24"/>
-        </w:rPr>
-        <w:t xml:space="preserve"> as shown in BOM</w:t>
-      </w:r>
-    </w:p>
-    <w:p>
-      <w:pPr>
-        <w:spacing w:after="0" w:line="240" w:lineRule="auto"/>
-        <w:rPr>
-          <w:sz w:val="24"/>
-          <w:szCs w:val="24"/>
-        </w:rPr>
-      </w:pPr>
-      <w:r>
-        <w:rPr>
-          <w:sz w:val="24"/>
-          <w:szCs w:val="24"/>
-        </w:rPr>
-        <w:t>4 – M5x12mm screws</w:t>
-      </w:r>
-    </w:p>
-    <w:p>
-      <w:pPr>
-        <w:spacing w:after="0" w:line="240" w:lineRule="auto"/>
-        <w:rPr>
-          <w:sz w:val="24"/>
-          <w:szCs w:val="24"/>
-        </w:rPr>
-      </w:pPr>
-      <w:r>
-        <w:rPr>
-          <w:sz w:val="24"/>
-          <w:szCs w:val="24"/>
-        </w:rPr>
-        <w:t>4 – Tee Nuts</w:t>
-      </w:r>
-    </w:p>
-    <w:p>
-      <w:pPr>
-        <w:spacing w:after="0" w:line="240" w:lineRule="auto"/>
-        <w:rPr>
-          <w:sz w:val="24"/>
-          <w:szCs w:val="24"/>
-        </w:rPr>
-      </w:pPr>
-      <w:r>
-        <w:rPr>
-          <w:sz w:val="24"/>
-          <w:szCs w:val="24"/>
-        </w:rPr>
-        <w:t xml:space="preserve">12 - </w:t>
-      </w:r>
-      <w:r>
-        <w:rPr>
-          <w:sz w:val="24"/>
-          <w:szCs w:val="24"/>
-        </w:rPr>
-        <w:t>M5 fender washers</w:t>
-      </w:r>
-      <w:r>
-        <w:rPr>
-          <w:sz w:val="24"/>
-          <w:szCs w:val="24"/>
-        </w:rPr>
-        <w:t xml:space="preserve"> as shown in BOM</w:t>
-      </w:r>
-    </w:p>
-    <w:p>
-      <w:pPr>
-        <w:spacing w:after="0" w:line="240" w:lineRule="auto"/>
-        <w:rPr>
-          <w:sz w:val="24"/>
-          <w:szCs w:val="24"/>
-        </w:rPr>
-      </w:pPr>
-    </w:p>
-    <w:p>
-      <w:pPr>
-        <w:spacing w:after="0" w:line="240" w:lineRule="auto"/>
-        <w:rPr>
-          <w:sz w:val="24"/>
-          <w:szCs w:val="24"/>
-        </w:rPr>
-      </w:pPr>
-      <w:r>
-        <w:rPr>
-          <w:sz w:val="24"/>
-          <w:szCs w:val="24"/>
-        </w:rPr>
         <w:t>Mount as shown in graphic below.</w:t>
       </w:r>
     </w:p>
@@ -2708,7 +2788,7 @@
                     <pic:cNvPicPr/>
                   </pic:nvPicPr>
                   <pic:blipFill>
-                    <a:blip r:embed="rId23">
+                    <a:blip r:embed="rId24">
                       <a:extLst>
                         <a:ext uri="{28A0092B-C50C-407E-A947-70E740481C1C}">
                           <a14:useLocalDpi xmlns:a14="http://schemas.microsoft.com/office/drawing/2010/main" val="0"/>
@@ -2767,7 +2847,6 @@
           <w:sz w:val="40"/>
           <w:szCs w:val="40"/>
         </w:rPr>
-        <w:lastRenderedPageBreak/>
         <w:t xml:space="preserve">Mount </w:t>
       </w:r>
       <w:r>
@@ -2861,6 +2940,49 @@
           <w:szCs w:val="24"/>
         </w:rPr>
       </w:pPr>
+    </w:p>
+    <w:p>
+      <w:pPr>
+        <w:spacing w:after="0" w:line="240" w:lineRule="auto"/>
+        <w:rPr>
+          <w:sz w:val="24"/>
+          <w:szCs w:val="24"/>
+        </w:rPr>
+      </w:pPr>
+      <w:r>
+        <w:rPr>
+          <w:sz w:val="24"/>
+          <w:szCs w:val="24"/>
+        </w:rPr>
+        <w:lastRenderedPageBreak/>
+        <w:t xml:space="preserve">To get the motor to correct height, use </w:t>
+      </w:r>
+      <w:proofErr w:type="spellStart"/>
+      <w:r>
+        <w:rPr>
+          <w:b/>
+          <w:sz w:val="24"/>
+          <w:szCs w:val="24"/>
+        </w:rPr>
+        <w:t>HexAdapter_Height_Shim.stl</w:t>
+      </w:r>
+      <w:proofErr w:type="spellEnd"/>
+      <w:r>
+        <w:rPr>
+          <w:sz w:val="24"/>
+          <w:szCs w:val="24"/>
+        </w:rPr>
+        <w:t xml:space="preserve"> between the top of the 2040 extrusion and the bottom of a flat side of the hex coupler.  Loosen the screws on the motor mount and adjust to fit on top of that shim.  It will probably be center of the slot opening on the mount.</w:t>
+      </w:r>
+    </w:p>
+    <w:p>
+      <w:pPr>
+        <w:spacing w:after="0" w:line="240" w:lineRule="auto"/>
+        <w:rPr>
+          <w:sz w:val="24"/>
+          <w:szCs w:val="24"/>
+        </w:rPr>
+      </w:pPr>
       <w:r>
         <w:rPr>
           <w:noProof/>
@@ -2869,9 +2991,9 @@
         </w:rPr>
         <w:drawing>
           <wp:inline distT="0" distB="0" distL="0" distR="0">
-            <wp:extent cx="6858000" cy="5143500"/>
-            <wp:effectExtent l="0" t="0" r="0" b="0"/>
-            <wp:docPr id="5" name="Picture 5"/>
+            <wp:extent cx="4229100" cy="3171825"/>
+            <wp:effectExtent l="0" t="0" r="0" b="9525"/>
+            <wp:docPr id="25" name="Picture 25"/>
             <wp:cNvGraphicFramePr>
               <a:graphicFrameLocks xmlns:a="http://schemas.openxmlformats.org/drawingml/2006/main" noChangeAspect="1"/>
             </wp:cNvGraphicFramePr>
@@ -2879,254 +3001,7 @@
               <a:graphicData uri="http://schemas.openxmlformats.org/drawingml/2006/picture">
                 <pic:pic xmlns:pic="http://schemas.openxmlformats.org/drawingml/2006/picture">
                   <pic:nvPicPr>
-                    <pic:cNvPr id="0" name="motor_gears_flour_Assy.jpg"/>
-                    <pic:cNvPicPr/>
-                  </pic:nvPicPr>
-                  <pic:blipFill>
-                    <a:blip r:embed="rId24">
-                      <a:extLst>
-                        <a:ext uri="{28A0092B-C50C-407E-A947-70E740481C1C}">
-                          <a14:useLocalDpi xmlns:a14="http://schemas.microsoft.com/office/drawing/2010/main" val="0"/>
-                        </a:ext>
-                      </a:extLst>
-                    </a:blip>
-                    <a:stretch>
-                      <a:fillRect/>
-                    </a:stretch>
-                  </pic:blipFill>
-                  <pic:spPr>
-                    <a:xfrm>
-                      <a:off x="0" y="0"/>
-                      <a:ext cx="6858000" cy="5143500"/>
-                    </a:xfrm>
-                    <a:prstGeom prst="rect">
-                      <a:avLst/>
-                    </a:prstGeom>
-                  </pic:spPr>
-                </pic:pic>
-              </a:graphicData>
-            </a:graphic>
-          </wp:inline>
-        </w:drawing>
-      </w:r>
-    </w:p>
-    <w:p>
-      <w:pPr>
-        <w:spacing w:after="0" w:line="240" w:lineRule="auto"/>
-        <w:rPr>
-          <w:sz w:val="24"/>
-          <w:szCs w:val="24"/>
-        </w:rPr>
-      </w:pPr>
-    </w:p>
-    <w:p>
-      <w:pPr>
-        <w:spacing w:after="0" w:line="240" w:lineRule="auto"/>
-        <w:rPr>
-          <w:sz w:val="24"/>
-          <w:szCs w:val="24"/>
-        </w:rPr>
-      </w:pPr>
-    </w:p>
-    <w:p>
-      <w:pPr>
-        <w:spacing w:after="0" w:line="240" w:lineRule="auto"/>
-        <w:rPr>
-          <w:sz w:val="24"/>
-          <w:szCs w:val="24"/>
-        </w:rPr>
-      </w:pPr>
-    </w:p>
-    <w:p>
-      <w:pPr>
-        <w:spacing w:after="0" w:line="240" w:lineRule="auto"/>
-        <w:rPr>
-          <w:sz w:val="24"/>
-          <w:szCs w:val="24"/>
-        </w:rPr>
-      </w:pPr>
-    </w:p>
-    <w:p>
-      <w:pPr>
-        <w:spacing w:after="0" w:line="240" w:lineRule="auto"/>
-        <w:rPr>
-          <w:sz w:val="24"/>
-          <w:szCs w:val="24"/>
-        </w:rPr>
-      </w:pPr>
-    </w:p>
-    <w:p>
-      <w:pPr>
-        <w:spacing w:after="0" w:line="240" w:lineRule="auto"/>
-        <w:rPr>
-          <w:sz w:val="24"/>
-          <w:szCs w:val="24"/>
-        </w:rPr>
-      </w:pPr>
-    </w:p>
-    <w:p>
-      <w:pPr>
-        <w:spacing w:after="0" w:line="240" w:lineRule="auto"/>
-        <w:rPr>
-          <w:sz w:val="24"/>
-          <w:szCs w:val="24"/>
-        </w:rPr>
-      </w:pPr>
-    </w:p>
-    <w:p>
-      <w:pPr>
-        <w:spacing w:after="0" w:line="240" w:lineRule="auto"/>
-        <w:rPr>
-          <w:sz w:val="24"/>
-          <w:szCs w:val="24"/>
-        </w:rPr>
-      </w:pPr>
-    </w:p>
-    <w:p>
-      <w:pPr>
-        <w:spacing w:after="0" w:line="240" w:lineRule="auto"/>
-        <w:rPr>
-          <w:sz w:val="24"/>
-          <w:szCs w:val="24"/>
-        </w:rPr>
-      </w:pPr>
-    </w:p>
-    <w:p>
-      <w:pPr>
-        <w:spacing w:after="0" w:line="240" w:lineRule="auto"/>
-        <w:rPr>
-          <w:sz w:val="24"/>
-          <w:szCs w:val="24"/>
-        </w:rPr>
-      </w:pPr>
-    </w:p>
-    <w:p>
-      <w:pPr>
-        <w:spacing w:after="0" w:line="240" w:lineRule="auto"/>
-        <w:rPr>
-          <w:sz w:val="24"/>
-          <w:szCs w:val="24"/>
-        </w:rPr>
-      </w:pPr>
-    </w:p>
-    <w:p>
-      <w:pPr>
-        <w:rPr>
-          <w:b/>
-          <w:sz w:val="40"/>
-          <w:szCs w:val="40"/>
-        </w:rPr>
-      </w:pPr>
-      <w:r>
-        <w:rPr>
-          <w:b/>
-          <w:sz w:val="40"/>
-          <w:szCs w:val="40"/>
-        </w:rPr>
-        <w:lastRenderedPageBreak/>
-        <w:t>End Cap Assembly</w:t>
-      </w:r>
-    </w:p>
-    <w:p>
-      <w:pPr>
-        <w:spacing w:after="0" w:line="240" w:lineRule="auto"/>
-        <w:rPr>
-          <w:sz w:val="24"/>
-          <w:szCs w:val="24"/>
-        </w:rPr>
-      </w:pPr>
-      <w:r>
-        <w:rPr>
-          <w:sz w:val="24"/>
-          <w:szCs w:val="24"/>
-        </w:rPr>
-        <w:t>4 – 3D printed End caps</w:t>
-      </w:r>
-    </w:p>
-    <w:p>
-      <w:pPr>
-        <w:spacing w:after="0" w:line="240" w:lineRule="auto"/>
-        <w:rPr>
-          <w:sz w:val="24"/>
-          <w:szCs w:val="24"/>
-        </w:rPr>
-      </w:pPr>
-      <w:r>
-        <w:rPr>
-          <w:sz w:val="24"/>
-          <w:szCs w:val="24"/>
-        </w:rPr>
-        <w:t>8 – M5x12mm screws</w:t>
-      </w:r>
-    </w:p>
-    <w:p>
-      <w:pPr>
-        <w:spacing w:after="0" w:line="240" w:lineRule="auto"/>
-        <w:rPr>
-          <w:sz w:val="24"/>
-          <w:szCs w:val="24"/>
-        </w:rPr>
-      </w:pPr>
-      <w:r>
-        <w:rPr>
-          <w:sz w:val="24"/>
-          <w:szCs w:val="24"/>
-        </w:rPr>
-        <w:t>8 – M5 Tee Nuts.</w:t>
-      </w:r>
-    </w:p>
-    <w:p>
-      <w:pPr>
-        <w:spacing w:after="0" w:line="240" w:lineRule="auto"/>
-        <w:rPr>
-          <w:sz w:val="24"/>
-          <w:szCs w:val="24"/>
-        </w:rPr>
-      </w:pPr>
-    </w:p>
-    <w:p>
-      <w:pPr>
-        <w:spacing w:after="0" w:line="240" w:lineRule="auto"/>
-        <w:rPr>
-          <w:sz w:val="24"/>
-          <w:szCs w:val="24"/>
-        </w:rPr>
-      </w:pPr>
-      <w:r>
-        <w:rPr>
-          <w:sz w:val="24"/>
-          <w:szCs w:val="24"/>
-        </w:rPr>
-        <w:t>Add the End Caps as shown.  They will be the same on both ends</w:t>
-      </w:r>
-    </w:p>
-    <w:p>
-      <w:pPr>
-        <w:spacing w:after="0" w:line="240" w:lineRule="auto"/>
-        <w:rPr>
-          <w:sz w:val="24"/>
-          <w:szCs w:val="24"/>
-        </w:rPr>
-      </w:pPr>
-      <w:r>
-        <w:rPr>
-          <w:noProof/>
-          <w:sz w:val="24"/>
-          <w:szCs w:val="24"/>
-        </w:rPr>
-        <w:drawing>
-          <wp:inline distT="0" distB="0" distL="0" distR="0">
-            <wp:extent cx="6858000" cy="5143500"/>
-            <wp:effectExtent l="0" t="0" r="0" b="0"/>
-            <wp:docPr id="11" name="Picture 11"/>
-            <wp:cNvGraphicFramePr>
-              <a:graphicFrameLocks xmlns:a="http://schemas.openxmlformats.org/drawingml/2006/main" noChangeAspect="1"/>
-            </wp:cNvGraphicFramePr>
-            <a:graphic xmlns:a="http://schemas.openxmlformats.org/drawingml/2006/main">
-              <a:graphicData uri="http://schemas.openxmlformats.org/drawingml/2006/picture">
-                <pic:pic xmlns:pic="http://schemas.openxmlformats.org/drawingml/2006/picture">
-                  <pic:nvPicPr>
-                    <pic:cNvPr id="0" name="EndCapAssembly.jpg"/>
+                    <pic:cNvPr id="0" name="Motor_ShimHeight.jpg"/>
                     <pic:cNvPicPr/>
                   </pic:nvPicPr>
                   <pic:blipFill>
@@ -3144,7 +3019,230 @@
                   <pic:spPr>
                     <a:xfrm>
                       <a:off x="0" y="0"/>
-                      <a:ext cx="6858000" cy="5143500"/>
+                      <a:ext cx="4229100" cy="3171825"/>
+                    </a:xfrm>
+                    <a:prstGeom prst="rect">
+                      <a:avLst/>
+                    </a:prstGeom>
+                  </pic:spPr>
+                </pic:pic>
+              </a:graphicData>
+            </a:graphic>
+          </wp:inline>
+        </w:drawing>
+      </w:r>
+    </w:p>
+    <w:p>
+      <w:pPr>
+        <w:spacing w:after="0" w:line="240" w:lineRule="auto"/>
+        <w:rPr>
+          <w:sz w:val="24"/>
+          <w:szCs w:val="24"/>
+        </w:rPr>
+      </w:pPr>
+      <w:r>
+        <w:rPr>
+          <w:noProof/>
+          <w:sz w:val="24"/>
+          <w:szCs w:val="24"/>
+        </w:rPr>
+        <w:drawing>
+          <wp:inline distT="0" distB="0" distL="0" distR="0">
+            <wp:extent cx="6375400" cy="4781550"/>
+            <wp:effectExtent l="0" t="0" r="6350" b="0"/>
+            <wp:docPr id="5" name="Picture 5"/>
+            <wp:cNvGraphicFramePr>
+              <a:graphicFrameLocks xmlns:a="http://schemas.openxmlformats.org/drawingml/2006/main" noChangeAspect="1"/>
+            </wp:cNvGraphicFramePr>
+            <a:graphic xmlns:a="http://schemas.openxmlformats.org/drawingml/2006/main">
+              <a:graphicData uri="http://schemas.openxmlformats.org/drawingml/2006/picture">
+                <pic:pic xmlns:pic="http://schemas.openxmlformats.org/drawingml/2006/picture">
+                  <pic:nvPicPr>
+                    <pic:cNvPr id="0" name="motor_gears_flour_Assy.jpg"/>
+                    <pic:cNvPicPr/>
+                  </pic:nvPicPr>
+                  <pic:blipFill>
+                    <a:blip r:embed="rId26">
+                      <a:extLst>
+                        <a:ext uri="{28A0092B-C50C-407E-A947-70E740481C1C}">
+                          <a14:useLocalDpi xmlns:a14="http://schemas.microsoft.com/office/drawing/2010/main" val="0"/>
+                        </a:ext>
+                      </a:extLst>
+                    </a:blip>
+                    <a:stretch>
+                      <a:fillRect/>
+                    </a:stretch>
+                  </pic:blipFill>
+                  <pic:spPr>
+                    <a:xfrm>
+                      <a:off x="0" y="0"/>
+                      <a:ext cx="6375400" cy="4781550"/>
+                    </a:xfrm>
+                    <a:prstGeom prst="rect">
+                      <a:avLst/>
+                    </a:prstGeom>
+                  </pic:spPr>
+                </pic:pic>
+              </a:graphicData>
+            </a:graphic>
+          </wp:inline>
+        </w:drawing>
+      </w:r>
+    </w:p>
+    <w:p>
+      <w:pPr>
+        <w:spacing w:after="0" w:line="240" w:lineRule="auto"/>
+        <w:rPr>
+          <w:sz w:val="24"/>
+          <w:szCs w:val="24"/>
+        </w:rPr>
+      </w:pPr>
+    </w:p>
+    <w:p>
+      <w:pPr>
+        <w:spacing w:after="0" w:line="240" w:lineRule="auto"/>
+        <w:rPr>
+          <w:sz w:val="24"/>
+          <w:szCs w:val="24"/>
+        </w:rPr>
+      </w:pPr>
+    </w:p>
+    <w:p>
+      <w:pPr>
+        <w:rPr>
+          <w:b/>
+          <w:sz w:val="40"/>
+          <w:szCs w:val="40"/>
+        </w:rPr>
+      </w:pPr>
+      <w:r>
+        <w:rPr>
+          <w:b/>
+          <w:sz w:val="40"/>
+          <w:szCs w:val="40"/>
+        </w:rPr>
+        <w:lastRenderedPageBreak/>
+        <w:t>End Cap Assembly</w:t>
+      </w:r>
+    </w:p>
+    <w:p>
+      <w:pPr>
+        <w:spacing w:after="0" w:line="240" w:lineRule="auto"/>
+        <w:rPr>
+          <w:sz w:val="24"/>
+          <w:szCs w:val="24"/>
+        </w:rPr>
+      </w:pPr>
+      <w:r>
+        <w:rPr>
+          <w:sz w:val="24"/>
+          <w:szCs w:val="24"/>
+        </w:rPr>
+        <w:t>4 – 3D printed End caps</w:t>
+      </w:r>
+    </w:p>
+    <w:p>
+      <w:pPr>
+        <w:spacing w:after="0" w:line="240" w:lineRule="auto"/>
+        <w:rPr>
+          <w:sz w:val="24"/>
+          <w:szCs w:val="24"/>
+        </w:rPr>
+      </w:pPr>
+      <w:r>
+        <w:rPr>
+          <w:sz w:val="24"/>
+          <w:szCs w:val="24"/>
+        </w:rPr>
+        <w:t>8 – M5x12mm screws</w:t>
+      </w:r>
+    </w:p>
+    <w:p>
+      <w:pPr>
+        <w:spacing w:after="0" w:line="240" w:lineRule="auto"/>
+        <w:rPr>
+          <w:sz w:val="24"/>
+          <w:szCs w:val="24"/>
+        </w:rPr>
+      </w:pPr>
+      <w:r>
+        <w:rPr>
+          <w:sz w:val="24"/>
+          <w:szCs w:val="24"/>
+        </w:rPr>
+        <w:t>8 – M5 Tee Nuts.</w:t>
+      </w:r>
+    </w:p>
+    <w:p>
+      <w:pPr>
+        <w:spacing w:after="0" w:line="240" w:lineRule="auto"/>
+        <w:rPr>
+          <w:sz w:val="24"/>
+          <w:szCs w:val="24"/>
+        </w:rPr>
+      </w:pPr>
+    </w:p>
+    <w:p>
+      <w:pPr>
+        <w:spacing w:after="0" w:line="240" w:lineRule="auto"/>
+        <w:rPr>
+          <w:sz w:val="24"/>
+          <w:szCs w:val="24"/>
+        </w:rPr>
+      </w:pPr>
+      <w:r>
+        <w:rPr>
+          <w:sz w:val="24"/>
+          <w:szCs w:val="24"/>
+        </w:rPr>
+        <w:t>Add the End Caps as shown.  They will be the same on both ends</w:t>
+      </w:r>
+    </w:p>
+    <w:p>
+      <w:pPr>
+        <w:spacing w:after="0" w:line="240" w:lineRule="auto"/>
+        <w:rPr>
+          <w:sz w:val="24"/>
+          <w:szCs w:val="24"/>
+        </w:rPr>
+      </w:pPr>
+      <w:r>
+        <w:rPr>
+          <w:noProof/>
+          <w:sz w:val="24"/>
+          <w:szCs w:val="24"/>
+        </w:rPr>
+        <w:drawing>
+          <wp:inline distT="0" distB="0" distL="0" distR="0">
+            <wp:extent cx="6029325" cy="4521994"/>
+            <wp:effectExtent l="0" t="0" r="0" b="0"/>
+            <wp:docPr id="26" name="Picture 26"/>
+            <wp:cNvGraphicFramePr>
+              <a:graphicFrameLocks xmlns:a="http://schemas.openxmlformats.org/drawingml/2006/main" noChangeAspect="1"/>
+            </wp:cNvGraphicFramePr>
+            <a:graphic xmlns:a="http://schemas.openxmlformats.org/drawingml/2006/main">
+              <a:graphicData uri="http://schemas.openxmlformats.org/drawingml/2006/picture">
+                <pic:pic xmlns:pic="http://schemas.openxmlformats.org/drawingml/2006/picture">
+                  <pic:nvPicPr>
+                    <pic:cNvPr id="0" name="EndCapAssembly.jpg"/>
+                    <pic:cNvPicPr/>
+                  </pic:nvPicPr>
+                  <pic:blipFill>
+                    <a:blip r:embed="rId27">
+                      <a:extLst>
+                        <a:ext uri="{28A0092B-C50C-407E-A947-70E740481C1C}">
+                          <a14:useLocalDpi xmlns:a14="http://schemas.microsoft.com/office/drawing/2010/main" val="0"/>
+                        </a:ext>
+                      </a:extLst>
+                    </a:blip>
+                    <a:stretch>
+                      <a:fillRect/>
+                    </a:stretch>
+                  </pic:blipFill>
+                  <pic:spPr>
+                    <a:xfrm>
+                      <a:off x="0" y="0"/>
+                      <a:ext cx="6029325" cy="4521994"/>
                     </a:xfrm>
                     <a:prstGeom prst="rect">
                       <a:avLst/>

</xml_diff>

<commit_message>
Adjusted README and buildguide
</commit_message>
<xml_diff>
--- a/docs/build-guide/Planetary Bean Bouncer Build Guide.docx
+++ b/docs/build-guide/Planetary Bean Bouncer Build Guide.docx
@@ -23,37 +23,84 @@
     <w:p>
       <w:pPr>
         <w:spacing w:after="0" w:line="240" w:lineRule="auto"/>
-        <w:rPr>
-          <w:sz w:val="24"/>
-          <w:szCs w:val="24"/>
-        </w:rPr>
-      </w:pPr>
-    </w:p>
-    <w:p>
-      <w:pPr>
-        <w:spacing w:after="0" w:line="240" w:lineRule="auto"/>
-        <w:rPr>
-          <w:sz w:val="24"/>
-          <w:szCs w:val="24"/>
-        </w:rPr>
-      </w:pPr>
-      <w:r>
-        <w:rPr>
-          <w:rStyle w:val="Strong"/>
+      </w:pPr>
+    </w:p>
+    <w:p>
+      <w:pPr>
+        <w:spacing w:after="0" w:line="240" w:lineRule="auto"/>
+      </w:pPr>
+      <w:r>
+        <w:rPr>
+          <w:b/>
         </w:rPr>
         <w:t>Before you begin</w:t>
       </w:r>
       <w:r>
-        <w:br/>
-        <w:t>– Review the full guide once before assembling</w:t>
-      </w:r>
-      <w:r>
-        <w:br/>
-        <w:t>– Verify you have all hardware listed in the BOM</w:t>
-      </w:r>
-      <w:r>
-        <w:br/>
-        <w:t>– Do not fully tighten fasteners until alignment is confirmed</w:t>
+        <w:t>:</w:t>
+      </w:r>
+    </w:p>
+    <w:p>
+      <w:pPr>
+        <w:spacing w:after="0" w:line="240" w:lineRule="auto"/>
+      </w:pPr>
+      <w:r>
+        <w:t>- Review the full guide once before assembling.</w:t>
+      </w:r>
+    </w:p>
+    <w:p>
+      <w:pPr>
+        <w:spacing w:after="0" w:line="240" w:lineRule="auto"/>
+      </w:pPr>
+      <w:r>
+        <w:t xml:space="preserve">- Print </w:t>
+      </w:r>
+      <w:r>
+        <w:rPr>
+          <w:b/>
+        </w:rPr>
+        <w:t>Test_1.stl</w:t>
+      </w:r>
+      <w:r>
+        <w:t xml:space="preserve"> to verify hole tolerances for screws, nuts, and bearings.</w:t>
+      </w:r>
+    </w:p>
+    <w:p>
+      <w:pPr>
+        <w:spacing w:after="0" w:line="240" w:lineRule="auto"/>
+      </w:pPr>
+      <w:r>
+        <w:t xml:space="preserve">- Print </w:t>
+      </w:r>
+      <w:r>
+        <w:rPr>
+          <w:b/>
+        </w:rPr>
+        <w:t>Geari</w:t>
+      </w:r>
+      <w:r>
+        <w:rPr>
+          <w:b/>
+        </w:rPr>
+        <w:t>ng_5_1_16_24_64_Test_Rev36.stl</w:t>
+      </w:r>
+      <w:r>
+        <w:t xml:space="preserve"> to test planetary gear meshing (can be used as a fidget after printing).</w:t>
+      </w:r>
+    </w:p>
+    <w:p>
+      <w:pPr>
+        <w:spacing w:after="0" w:line="240" w:lineRule="auto"/>
+      </w:pPr>
+      <w:r>
+        <w:t>- Verify you have all hardware listed in the BOM.</w:t>
+      </w:r>
+    </w:p>
+    <w:p>
+      <w:pPr>
+        <w:spacing w:after="0" w:line="240" w:lineRule="auto"/>
+      </w:pPr>
+      <w:r>
+        <w:t>- Do not fully tighten fasteners until shaft alignment is confirmed.</w:t>
       </w:r>
     </w:p>
     <w:p>
@@ -143,7 +190,7 @@
                     <pic:cNvPicPr/>
                   </pic:nvPicPr>
                   <pic:blipFill>
-                    <a:blip r:embed="rId5" cstate="print">
+                    <a:blip r:embed="rId6" cstate="print">
                       <a:extLst>
                         <a:ext uri="{28A0092B-C50C-407E-A947-70E740481C1C}">
                           <a14:useLocalDpi xmlns:a14="http://schemas.microsoft.com/office/drawing/2010/main" val="0"/>
@@ -288,8 +335,8 @@
         </w:rPr>
         <w:drawing>
           <wp:inline distT="0" distB="0" distL="0" distR="0">
-            <wp:extent cx="2882900" cy="2162175"/>
-            <wp:effectExtent l="0" t="0" r="0" b="9525"/>
+            <wp:extent cx="2438400" cy="1828800"/>
+            <wp:effectExtent l="0" t="0" r="0" b="0"/>
             <wp:docPr id="23" name="Picture 23"/>
             <wp:cNvGraphicFramePr>
               <a:graphicFrameLocks xmlns:a="http://schemas.openxmlformats.org/drawingml/2006/main" noChangeAspect="1"/>
@@ -302,7 +349,7 @@
                     <pic:cNvPicPr/>
                   </pic:nvPicPr>
                   <pic:blipFill>
-                    <a:blip r:embed="rId6" cstate="print">
+                    <a:blip r:embed="rId7" cstate="print">
                       <a:extLst>
                         <a:ext uri="{28A0092B-C50C-407E-A947-70E740481C1C}">
                           <a14:useLocalDpi xmlns:a14="http://schemas.microsoft.com/office/drawing/2010/main" val="0"/>
@@ -316,7 +363,7 @@
                   <pic:spPr>
                     <a:xfrm>
                       <a:off x="0" y="0"/>
-                      <a:ext cx="2882900" cy="2162175"/>
+                      <a:ext cx="2438400" cy="1828800"/>
                     </a:xfrm>
                     <a:prstGeom prst="rect">
                       <a:avLst/>
@@ -390,7 +437,7 @@
                     <pic:cNvPicPr/>
                   </pic:nvPicPr>
                   <pic:blipFill>
-                    <a:blip r:embed="rId7">
+                    <a:blip r:embed="rId8">
                       <a:extLst>
                         <a:ext uri="{28A0092B-C50C-407E-A947-70E740481C1C}">
                           <a14:useLocalDpi xmlns:a14="http://schemas.microsoft.com/office/drawing/2010/main" val="0"/>
@@ -453,7 +500,7 @@
                     <pic:cNvPicPr/>
                   </pic:nvPicPr>
                   <pic:blipFill>
-                    <a:blip r:embed="rId8">
+                    <a:blip r:embed="rId9">
                       <a:extLst>
                         <a:ext uri="{28A0092B-C50C-407E-A947-70E740481C1C}">
                           <a14:useLocalDpi xmlns:a14="http://schemas.microsoft.com/office/drawing/2010/main" val="0"/>
@@ -522,7 +569,7 @@
                     <pic:cNvPicPr/>
                   </pic:nvPicPr>
                   <pic:blipFill>
-                    <a:blip r:embed="rId9">
+                    <a:blip r:embed="rId10">
                       <a:extLst>
                         <a:ext uri="{28A0092B-C50C-407E-A947-70E740481C1C}">
                           <a14:useLocalDpi xmlns:a14="http://schemas.microsoft.com/office/drawing/2010/main" val="0"/>
@@ -587,7 +634,7 @@
                     <pic:cNvPicPr/>
                   </pic:nvPicPr>
                   <pic:blipFill>
-                    <a:blip r:embed="rId10">
+                    <a:blip r:embed="rId11">
                       <a:extLst>
                         <a:ext uri="{28A0092B-C50C-407E-A947-70E740481C1C}">
                           <a14:useLocalDpi xmlns:a14="http://schemas.microsoft.com/office/drawing/2010/main" val="0"/>
@@ -647,7 +694,7 @@
                     <pic:cNvPicPr/>
                   </pic:nvPicPr>
                   <pic:blipFill>
-                    <a:blip r:embed="rId11">
+                    <a:blip r:embed="rId12">
                       <a:extLst>
                         <a:ext uri="{28A0092B-C50C-407E-A947-70E740481C1C}">
                           <a14:useLocalDpi xmlns:a14="http://schemas.microsoft.com/office/drawing/2010/main" val="0"/>
@@ -700,7 +747,7 @@
                     <pic:cNvPicPr/>
                   </pic:nvPicPr>
                   <pic:blipFill>
-                    <a:blip r:embed="rId12">
+                    <a:blip r:embed="rId13">
                       <a:extLst>
                         <a:ext uri="{28A0092B-C50C-407E-A947-70E740481C1C}">
                           <a14:useLocalDpi xmlns:a14="http://schemas.microsoft.com/office/drawing/2010/main" val="0"/>
@@ -760,7 +807,7 @@
                     <pic:cNvPicPr/>
                   </pic:nvPicPr>
                   <pic:blipFill>
-                    <a:blip r:embed="rId13">
+                    <a:blip r:embed="rId14">
                       <a:extLst>
                         <a:ext uri="{28A0092B-C50C-407E-A947-70E740481C1C}">
                           <a14:useLocalDpi xmlns:a14="http://schemas.microsoft.com/office/drawing/2010/main" val="0"/>
@@ -789,15 +836,7 @@
     </w:p>
     <w:p>
       <w:r>
-        <w:t>Attach Bearing_Column_1 and Bearing_Column_2 to the end of the 2040x500mm top frames and the short 2040x140mm extrusion as shown.  Make sure you have a Tee Nut as shown in the middle of short 2040.  It does not have to be centered yet.  Use 8-</w:t>
-      </w:r>
-      <w:bookmarkStart w:id="0" w:name="_GoBack"/>
-      <w:r>
-        <w:t>M5x12mm</w:t>
-      </w:r>
-      <w:bookmarkEnd w:id="0"/>
-      <w:r>
-        <w:t xml:space="preserve"> screws with Tee Nuts in the extrusions to connect these.</w:t>
+        <w:t>Attach Bearing_Column_1 and Bearing_Column_2 to the end of the 2040x500mm top frames and the short 2040x140mm extrusion as shown.  Make sure you have a Tee Nut as shown in the middle of short 2040.  It does not have to be centered yet.  Use 8-M5x12mm screws with Tee Nuts in the extrusions to connect these.</w:t>
       </w:r>
     </w:p>
     <w:p>
@@ -821,7 +860,7 @@
                     <pic:cNvPicPr/>
                   </pic:nvPicPr>
                   <pic:blipFill>
-                    <a:blip r:embed="rId14"/>
+                    <a:blip r:embed="rId15"/>
                     <a:stretch>
                       <a:fillRect/>
                     </a:stretch>
@@ -896,7 +935,7 @@
                     <pic:cNvPicPr/>
                   </pic:nvPicPr>
                   <pic:blipFill>
-                    <a:blip r:embed="rId15">
+                    <a:blip r:embed="rId16">
                       <a:extLst>
                         <a:ext uri="{28A0092B-C50C-407E-A947-70E740481C1C}">
                           <a14:useLocalDpi xmlns:a14="http://schemas.microsoft.com/office/drawing/2010/main" val="0"/>
@@ -975,7 +1014,7 @@
                     <pic:cNvPicPr/>
                   </pic:nvPicPr>
                   <pic:blipFill>
-                    <a:blip r:embed="rId16" cstate="print">
+                    <a:blip r:embed="rId17" cstate="print">
                       <a:extLst>
                         <a:ext uri="{28A0092B-C50C-407E-A947-70E740481C1C}">
                           <a14:useLocalDpi xmlns:a14="http://schemas.microsoft.com/office/drawing/2010/main" val="0"/>
@@ -1027,7 +1066,7 @@
                     <pic:cNvPicPr/>
                   </pic:nvPicPr>
                   <pic:blipFill>
-                    <a:blip r:embed="rId17" cstate="print">
+                    <a:blip r:embed="rId18" cstate="print">
                       <a:extLst>
                         <a:ext uri="{28A0092B-C50C-407E-A947-70E740481C1C}">
                           <a14:useLocalDpi xmlns:a14="http://schemas.microsoft.com/office/drawing/2010/main" val="0"/>
@@ -1101,7 +1140,7 @@
                     <pic:cNvPicPr/>
                   </pic:nvPicPr>
                   <pic:blipFill>
-                    <a:blip r:embed="rId18">
+                    <a:blip r:embed="rId19">
                       <a:extLst>
                         <a:ext uri="{28A0092B-C50C-407E-A947-70E740481C1C}">
                           <a14:useLocalDpi xmlns:a14="http://schemas.microsoft.com/office/drawing/2010/main" val="0"/>
@@ -1164,7 +1203,7 @@
                     <pic:cNvPicPr/>
                   </pic:nvPicPr>
                   <pic:blipFill>
-                    <a:blip r:embed="rId19">
+                    <a:blip r:embed="rId20">
                       <a:extLst>
                         <a:ext uri="{28A0092B-C50C-407E-A947-70E740481C1C}">
                           <a14:useLocalDpi xmlns:a14="http://schemas.microsoft.com/office/drawing/2010/main" val="0"/>
@@ -1224,7 +1263,7 @@
                     <pic:cNvPicPr/>
                   </pic:nvPicPr>
                   <pic:blipFill>
-                    <a:blip r:embed="rId20">
+                    <a:blip r:embed="rId21">
                       <a:extLst>
                         <a:ext uri="{28A0092B-C50C-407E-A947-70E740481C1C}">
                           <a14:useLocalDpi xmlns:a14="http://schemas.microsoft.com/office/drawing/2010/main" val="0"/>
@@ -1614,7 +1653,7 @@
                     <pic:cNvPicPr/>
                   </pic:nvPicPr>
                   <pic:blipFill>
-                    <a:blip r:embed="rId21">
+                    <a:blip r:embed="rId22">
                       <a:extLst>
                         <a:ext uri="{28A0092B-C50C-407E-A947-70E740481C1C}">
                           <a14:useLocalDpi xmlns:a14="http://schemas.microsoft.com/office/drawing/2010/main" val="0"/>
@@ -1884,80 +1923,6 @@
     </w:p>
     <w:p/>
     <w:p/>
-    <w:p/>
-    <w:p/>
-    <w:p>
-      <w:pPr>
-        <w:rPr>
-          <w:b/>
-          <w:sz w:val="40"/>
-          <w:szCs w:val="40"/>
-        </w:rPr>
-      </w:pPr>
-    </w:p>
-    <w:p>
-      <w:pPr>
-        <w:rPr>
-          <w:b/>
-          <w:sz w:val="40"/>
-          <w:szCs w:val="40"/>
-        </w:rPr>
-      </w:pPr>
-    </w:p>
-    <w:p>
-      <w:pPr>
-        <w:rPr>
-          <w:b/>
-          <w:sz w:val="40"/>
-          <w:szCs w:val="40"/>
-        </w:rPr>
-      </w:pPr>
-    </w:p>
-    <w:p>
-      <w:pPr>
-        <w:rPr>
-          <w:b/>
-          <w:sz w:val="40"/>
-          <w:szCs w:val="40"/>
-        </w:rPr>
-      </w:pPr>
-    </w:p>
-    <w:p>
-      <w:pPr>
-        <w:rPr>
-          <w:b/>
-          <w:sz w:val="40"/>
-          <w:szCs w:val="40"/>
-        </w:rPr>
-      </w:pPr>
-    </w:p>
-    <w:p>
-      <w:pPr>
-        <w:rPr>
-          <w:b/>
-          <w:sz w:val="40"/>
-          <w:szCs w:val="40"/>
-        </w:rPr>
-      </w:pPr>
-    </w:p>
-    <w:p>
-      <w:pPr>
-        <w:rPr>
-          <w:b/>
-          <w:sz w:val="40"/>
-          <w:szCs w:val="40"/>
-        </w:rPr>
-      </w:pPr>
-    </w:p>
-    <w:p>
-      <w:pPr>
-        <w:rPr>
-          <w:b/>
-          <w:sz w:val="40"/>
-          <w:szCs w:val="40"/>
-        </w:rPr>
-      </w:pPr>
-    </w:p>
     <w:p>
       <w:pPr>
         <w:rPr>
@@ -2185,7 +2150,6 @@
           <w:sz w:val="40"/>
           <w:szCs w:val="40"/>
         </w:rPr>
-        <w:lastRenderedPageBreak/>
         <w:drawing>
           <wp:inline distT="0" distB="0" distL="0" distR="0">
             <wp:extent cx="6438900" cy="4829175"/>
@@ -2202,7 +2166,7 @@
                     <pic:cNvPicPr/>
                   </pic:nvPicPr>
                   <pic:blipFill>
-                    <a:blip r:embed="rId22">
+                    <a:blip r:embed="rId23">
                       <a:extLst>
                         <a:ext uri="{28A0092B-C50C-407E-A947-70E740481C1C}">
                           <a14:useLocalDpi xmlns:a14="http://schemas.microsoft.com/office/drawing/2010/main" val="0"/>
@@ -2233,8 +2197,6 @@
     <w:p/>
     <w:p/>
     <w:p/>
-    <w:p/>
-    <w:p/>
     <w:p>
       <w:pPr>
         <w:rPr>
@@ -2249,6 +2211,7 @@
           <w:sz w:val="40"/>
           <w:szCs w:val="40"/>
         </w:rPr>
+        <w:lastRenderedPageBreak/>
         <w:t>Wobble Disc Assembly</w:t>
       </w:r>
       <w:r>
@@ -2399,7 +2362,6 @@
           <w:sz w:val="24"/>
           <w:szCs w:val="24"/>
         </w:rPr>
-        <w:lastRenderedPageBreak/>
         <w:t xml:space="preserve">4 – Regular M5 </w:t>
       </w:r>
       <w:r>
@@ -2540,7 +2502,7 @@
                     <pic:cNvPicPr/>
                   </pic:nvPicPr>
                   <pic:blipFill>
-                    <a:blip r:embed="rId23">
+                    <a:blip r:embed="rId24">
                       <a:extLst>
                         <a:ext uri="{28A0092B-C50C-407E-A947-70E740481C1C}">
                           <a14:useLocalDpi xmlns:a14="http://schemas.microsoft.com/office/drawing/2010/main" val="0"/>
@@ -2581,6 +2543,7 @@
           <w:sz w:val="40"/>
           <w:szCs w:val="40"/>
         </w:rPr>
+        <w:lastRenderedPageBreak/>
         <w:t>Mount Flour Sifter Assembly to Frame</w:t>
       </w:r>
     </w:p>
@@ -2754,7 +2717,6 @@
           <w:sz w:val="24"/>
           <w:szCs w:val="24"/>
         </w:rPr>
-        <w:lastRenderedPageBreak/>
         <w:t>Mount as shown in graphic below.</w:t>
       </w:r>
     </w:p>
@@ -2788,7 +2750,7 @@
                     <pic:cNvPicPr/>
                   </pic:nvPicPr>
                   <pic:blipFill>
-                    <a:blip r:embed="rId24">
+                    <a:blip r:embed="rId25">
                       <a:extLst>
                         <a:ext uri="{28A0092B-C50C-407E-A947-70E740481C1C}">
                           <a14:useLocalDpi xmlns:a14="http://schemas.microsoft.com/office/drawing/2010/main" val="0"/>
@@ -2847,6 +2809,7 @@
           <w:sz w:val="40"/>
           <w:szCs w:val="40"/>
         </w:rPr>
+        <w:lastRenderedPageBreak/>
         <w:t xml:space="preserve">Mount </w:t>
       </w:r>
       <w:r>
@@ -2954,7 +2917,6 @@
           <w:sz w:val="24"/>
           <w:szCs w:val="24"/>
         </w:rPr>
-        <w:lastRenderedPageBreak/>
         <w:t xml:space="preserve">To get the motor to correct height, use </w:t>
       </w:r>
       <w:proofErr w:type="spellStart"/>
@@ -2991,8 +2953,8 @@
         </w:rPr>
         <w:drawing>
           <wp:inline distT="0" distB="0" distL="0" distR="0">
-            <wp:extent cx="4229100" cy="3171825"/>
-            <wp:effectExtent l="0" t="0" r="0" b="9525"/>
+            <wp:extent cx="3800475" cy="2850356"/>
+            <wp:effectExtent l="0" t="0" r="0" b="7620"/>
             <wp:docPr id="25" name="Picture 25"/>
             <wp:cNvGraphicFramePr>
               <a:graphicFrameLocks xmlns:a="http://schemas.openxmlformats.org/drawingml/2006/main" noChangeAspect="1"/>
@@ -3002,63 +2964,6 @@
                 <pic:pic xmlns:pic="http://schemas.openxmlformats.org/drawingml/2006/picture">
                   <pic:nvPicPr>
                     <pic:cNvPr id="0" name="Motor_ShimHeight.jpg"/>
-                    <pic:cNvPicPr/>
-                  </pic:nvPicPr>
-                  <pic:blipFill>
-                    <a:blip r:embed="rId25">
-                      <a:extLst>
-                        <a:ext uri="{28A0092B-C50C-407E-A947-70E740481C1C}">
-                          <a14:useLocalDpi xmlns:a14="http://schemas.microsoft.com/office/drawing/2010/main" val="0"/>
-                        </a:ext>
-                      </a:extLst>
-                    </a:blip>
-                    <a:stretch>
-                      <a:fillRect/>
-                    </a:stretch>
-                  </pic:blipFill>
-                  <pic:spPr>
-                    <a:xfrm>
-                      <a:off x="0" y="0"/>
-                      <a:ext cx="4229100" cy="3171825"/>
-                    </a:xfrm>
-                    <a:prstGeom prst="rect">
-                      <a:avLst/>
-                    </a:prstGeom>
-                  </pic:spPr>
-                </pic:pic>
-              </a:graphicData>
-            </a:graphic>
-          </wp:inline>
-        </w:drawing>
-      </w:r>
-    </w:p>
-    <w:p>
-      <w:pPr>
-        <w:spacing w:after="0" w:line="240" w:lineRule="auto"/>
-        <w:rPr>
-          <w:sz w:val="24"/>
-          <w:szCs w:val="24"/>
-        </w:rPr>
-      </w:pPr>
-      <w:r>
-        <w:rPr>
-          <w:noProof/>
-          <w:sz w:val="24"/>
-          <w:szCs w:val="24"/>
-        </w:rPr>
-        <w:drawing>
-          <wp:inline distT="0" distB="0" distL="0" distR="0">
-            <wp:extent cx="6375400" cy="4781550"/>
-            <wp:effectExtent l="0" t="0" r="6350" b="0"/>
-            <wp:docPr id="5" name="Picture 5"/>
-            <wp:cNvGraphicFramePr>
-              <a:graphicFrameLocks xmlns:a="http://schemas.openxmlformats.org/drawingml/2006/main" noChangeAspect="1"/>
-            </wp:cNvGraphicFramePr>
-            <a:graphic xmlns:a="http://schemas.openxmlformats.org/drawingml/2006/main">
-              <a:graphicData uri="http://schemas.openxmlformats.org/drawingml/2006/picture">
-                <pic:pic xmlns:pic="http://schemas.openxmlformats.org/drawingml/2006/picture">
-                  <pic:nvPicPr>
-                    <pic:cNvPr id="0" name="motor_gears_flour_Assy.jpg"/>
                     <pic:cNvPicPr/>
                   </pic:nvPicPr>
                   <pic:blipFill>
@@ -3076,7 +2981,7 @@
                   <pic:spPr>
                     <a:xfrm>
                       <a:off x="0" y="0"/>
-                      <a:ext cx="6375400" cy="4781550"/>
+                      <a:ext cx="3800475" cy="2850356"/>
                     </a:xfrm>
                     <a:prstGeom prst="rect">
                       <a:avLst/>
@@ -3088,6 +2993,65 @@
           </wp:inline>
         </w:drawing>
       </w:r>
+      <w:bookmarkStart w:id="0" w:name="_GoBack"/>
+      <w:bookmarkEnd w:id="0"/>
+    </w:p>
+    <w:p>
+      <w:pPr>
+        <w:spacing w:after="0" w:line="240" w:lineRule="auto"/>
+        <w:rPr>
+          <w:sz w:val="24"/>
+          <w:szCs w:val="24"/>
+        </w:rPr>
+      </w:pPr>
+      <w:r>
+        <w:rPr>
+          <w:noProof/>
+          <w:sz w:val="24"/>
+          <w:szCs w:val="24"/>
+        </w:rPr>
+        <w:drawing>
+          <wp:inline distT="0" distB="0" distL="0" distR="0">
+            <wp:extent cx="4410075" cy="3307556"/>
+            <wp:effectExtent l="0" t="0" r="0" b="7620"/>
+            <wp:docPr id="5" name="Picture 5"/>
+            <wp:cNvGraphicFramePr>
+              <a:graphicFrameLocks xmlns:a="http://schemas.openxmlformats.org/drawingml/2006/main" noChangeAspect="1"/>
+            </wp:cNvGraphicFramePr>
+            <a:graphic xmlns:a="http://schemas.openxmlformats.org/drawingml/2006/main">
+              <a:graphicData uri="http://schemas.openxmlformats.org/drawingml/2006/picture">
+                <pic:pic xmlns:pic="http://schemas.openxmlformats.org/drawingml/2006/picture">
+                  <pic:nvPicPr>
+                    <pic:cNvPr id="0" name="motor_gears_flour_Assy.jpg"/>
+                    <pic:cNvPicPr/>
+                  </pic:nvPicPr>
+                  <pic:blipFill>
+                    <a:blip r:embed="rId27">
+                      <a:extLst>
+                        <a:ext uri="{28A0092B-C50C-407E-A947-70E740481C1C}">
+                          <a14:useLocalDpi xmlns:a14="http://schemas.microsoft.com/office/drawing/2010/main" val="0"/>
+                        </a:ext>
+                      </a:extLst>
+                    </a:blip>
+                    <a:stretch>
+                      <a:fillRect/>
+                    </a:stretch>
+                  </pic:blipFill>
+                  <pic:spPr>
+                    <a:xfrm>
+                      <a:off x="0" y="0"/>
+                      <a:ext cx="4415152" cy="3311364"/>
+                    </a:xfrm>
+                    <a:prstGeom prst="rect">
+                      <a:avLst/>
+                    </a:prstGeom>
+                  </pic:spPr>
+                </pic:pic>
+              </a:graphicData>
+            </a:graphic>
+          </wp:inline>
+        </w:drawing>
+      </w:r>
     </w:p>
     <w:p>
       <w:pPr>
@@ -3121,7 +3085,6 @@
           <w:sz w:val="40"/>
           <w:szCs w:val="40"/>
         </w:rPr>
-        <w:lastRenderedPageBreak/>
         <w:t>End Cap Assembly</w:t>
       </w:r>
     </w:p>
@@ -3228,7 +3191,7 @@
                     <pic:cNvPicPr/>
                   </pic:nvPicPr>
                   <pic:blipFill>
-                    <a:blip r:embed="rId27">
+                    <a:blip r:embed="rId28">
                       <a:extLst>
                         <a:ext uri="{28A0092B-C50C-407E-A947-70E740481C1C}">
                           <a14:useLocalDpi xmlns:a14="http://schemas.microsoft.com/office/drawing/2010/main" val="0"/>
@@ -3302,6 +3265,127 @@
     </w:sectPr>
   </w:body>
 </w:document>
+</file>
+
+<file path=word/numbering.xml><?xml version="1.0" encoding="utf-8"?>
+<w:numbering xmlns:wpc="http://schemas.microsoft.com/office/word/2010/wordprocessingCanvas" xmlns:mc="http://schemas.openxmlformats.org/markup-compatibility/2006" xmlns:o="urn:schemas-microsoft-com:office:office" xmlns:r="http://schemas.openxmlformats.org/officeDocument/2006/relationships" xmlns:m="http://schemas.openxmlformats.org/officeDocument/2006/math" xmlns:v="urn:schemas-microsoft-com:vml" xmlns:wp14="http://schemas.microsoft.com/office/word/2010/wordprocessingDrawing" xmlns:wp="http://schemas.openxmlformats.org/drawingml/2006/wordprocessingDrawing" xmlns:w10="urn:schemas-microsoft-com:office:word" xmlns:w="http://schemas.openxmlformats.org/wordprocessingml/2006/main" xmlns:w14="http://schemas.microsoft.com/office/word/2010/wordml" xmlns:wpg="http://schemas.microsoft.com/office/word/2010/wordprocessingGroup" xmlns:wpi="http://schemas.microsoft.com/office/word/2010/wordprocessingInk" xmlns:wne="http://schemas.microsoft.com/office/word/2006/wordml" xmlns:wps="http://schemas.microsoft.com/office/word/2010/wordprocessingShape" mc:Ignorable="w14 wp14">
+  <w:abstractNum w:abstractNumId="0">
+    <w:nsid w:val="199F2889"/>
+    <w:multiLevelType w:val="hybridMultilevel"/>
+    <w:tmpl w:val="E0023D40"/>
+    <w:lvl w:ilvl="0" w:tplc="32C413A4">
+      <w:numFmt w:val="bullet"/>
+      <w:lvlText w:val="-"/>
+      <w:lvlJc w:val="left"/>
+      <w:pPr>
+        <w:ind w:left="720" w:hanging="360"/>
+      </w:pPr>
+      <w:rPr>
+        <w:rFonts w:ascii="Calibri" w:eastAsiaTheme="minorHAnsi" w:hAnsi="Calibri" w:cs="Calibri" w:hint="default"/>
+        <w:sz w:val="22"/>
+      </w:rPr>
+    </w:lvl>
+    <w:lvl w:ilvl="1" w:tplc="04090003" w:tentative="1">
+      <w:start w:val="1"/>
+      <w:numFmt w:val="bullet"/>
+      <w:lvlText w:val="o"/>
+      <w:lvlJc w:val="left"/>
+      <w:pPr>
+        <w:ind w:left="1440" w:hanging="360"/>
+      </w:pPr>
+      <w:rPr>
+        <w:rFonts w:ascii="Courier New" w:hAnsi="Courier New" w:cs="Courier New" w:hint="default"/>
+      </w:rPr>
+    </w:lvl>
+    <w:lvl w:ilvl="2" w:tplc="04090005" w:tentative="1">
+      <w:start w:val="1"/>
+      <w:numFmt w:val="bullet"/>
+      <w:lvlText w:val=""/>
+      <w:lvlJc w:val="left"/>
+      <w:pPr>
+        <w:ind w:left="2160" w:hanging="360"/>
+      </w:pPr>
+      <w:rPr>
+        <w:rFonts w:ascii="Wingdings" w:hAnsi="Wingdings" w:hint="default"/>
+      </w:rPr>
+    </w:lvl>
+    <w:lvl w:ilvl="3" w:tplc="04090001" w:tentative="1">
+      <w:start w:val="1"/>
+      <w:numFmt w:val="bullet"/>
+      <w:lvlText w:val=""/>
+      <w:lvlJc w:val="left"/>
+      <w:pPr>
+        <w:ind w:left="2880" w:hanging="360"/>
+      </w:pPr>
+      <w:rPr>
+        <w:rFonts w:ascii="Symbol" w:hAnsi="Symbol" w:hint="default"/>
+      </w:rPr>
+    </w:lvl>
+    <w:lvl w:ilvl="4" w:tplc="04090003" w:tentative="1">
+      <w:start w:val="1"/>
+      <w:numFmt w:val="bullet"/>
+      <w:lvlText w:val="o"/>
+      <w:lvlJc w:val="left"/>
+      <w:pPr>
+        <w:ind w:left="3600" w:hanging="360"/>
+      </w:pPr>
+      <w:rPr>
+        <w:rFonts w:ascii="Courier New" w:hAnsi="Courier New" w:cs="Courier New" w:hint="default"/>
+      </w:rPr>
+    </w:lvl>
+    <w:lvl w:ilvl="5" w:tplc="04090005" w:tentative="1">
+      <w:start w:val="1"/>
+      <w:numFmt w:val="bullet"/>
+      <w:lvlText w:val=""/>
+      <w:lvlJc w:val="left"/>
+      <w:pPr>
+        <w:ind w:left="4320" w:hanging="360"/>
+      </w:pPr>
+      <w:rPr>
+        <w:rFonts w:ascii="Wingdings" w:hAnsi="Wingdings" w:hint="default"/>
+      </w:rPr>
+    </w:lvl>
+    <w:lvl w:ilvl="6" w:tplc="04090001" w:tentative="1">
+      <w:start w:val="1"/>
+      <w:numFmt w:val="bullet"/>
+      <w:lvlText w:val=""/>
+      <w:lvlJc w:val="left"/>
+      <w:pPr>
+        <w:ind w:left="5040" w:hanging="360"/>
+      </w:pPr>
+      <w:rPr>
+        <w:rFonts w:ascii="Symbol" w:hAnsi="Symbol" w:hint="default"/>
+      </w:rPr>
+    </w:lvl>
+    <w:lvl w:ilvl="7" w:tplc="04090003" w:tentative="1">
+      <w:start w:val="1"/>
+      <w:numFmt w:val="bullet"/>
+      <w:lvlText w:val="o"/>
+      <w:lvlJc w:val="left"/>
+      <w:pPr>
+        <w:ind w:left="5760" w:hanging="360"/>
+      </w:pPr>
+      <w:rPr>
+        <w:rFonts w:ascii="Courier New" w:hAnsi="Courier New" w:cs="Courier New" w:hint="default"/>
+      </w:rPr>
+    </w:lvl>
+    <w:lvl w:ilvl="8" w:tplc="04090005" w:tentative="1">
+      <w:start w:val="1"/>
+      <w:numFmt w:val="bullet"/>
+      <w:lvlText w:val=""/>
+      <w:lvlJc w:val="left"/>
+      <w:pPr>
+        <w:ind w:left="6480" w:hanging="360"/>
+      </w:pPr>
+      <w:rPr>
+        <w:rFonts w:ascii="Wingdings" w:hAnsi="Wingdings" w:hint="default"/>
+      </w:rPr>
+    </w:lvl>
+  </w:abstractNum>
+  <w:num w:numId="1">
+    <w:abstractNumId w:val="0"/>
+  </w:num>
+</w:numbering>
 </file>
 
 <file path=word/styles.xml><?xml version="1.0" encoding="utf-8"?>
@@ -3532,6 +3616,17 @@
       <w:bCs/>
     </w:rPr>
   </w:style>
+  <w:style w:type="paragraph" w:styleId="ListParagraph">
+    <w:name w:val="List Paragraph"/>
+    <w:basedOn w:val="Normal"/>
+    <w:uiPriority w:val="34"/>
+    <w:qFormat/>
+    <w:rsid w:val="0006478B"/>
+    <w:pPr>
+      <w:ind w:left="720"/>
+      <w:contextualSpacing/>
+    </w:pPr>
+  </w:style>
 </w:styles>
 </file>
 
@@ -3762,6 +3857,17 @@
       <w:b/>
       <w:bCs/>
     </w:rPr>
+  </w:style>
+  <w:style w:type="paragraph" w:styleId="ListParagraph">
+    <w:name w:val="List Paragraph"/>
+    <w:basedOn w:val="Normal"/>
+    <w:uiPriority w:val="34"/>
+    <w:qFormat/>
+    <w:rsid w:val="0006478B"/>
+    <w:pPr>
+      <w:ind w:left="720"/>
+      <w:contextualSpacing/>
+    </w:pPr>
   </w:style>
 </w:styles>
 </file>

</xml_diff>

<commit_message>
Minor Changes before release
</commit_message>
<xml_diff>
--- a/docs/build-guide/Planetary Bean Bouncer Build Guide.docx
+++ b/docs/build-guide/Planetary Bean Bouncer Build Guide.docx
@@ -75,13 +75,7 @@
         <w:rPr>
           <w:b/>
         </w:rPr>
-        <w:t>Geari</w:t>
-      </w:r>
-      <w:r>
-        <w:rPr>
-          <w:b/>
-        </w:rPr>
-        <w:t>ng_5_1_16_24_64_Test_Rev36.stl</w:t>
+        <w:t>Gearing_5_1_16_24_64_Test_Rev36.stl</w:t>
       </w:r>
       <w:r>
         <w:t xml:space="preserve"> to test planetary gear meshing (can be used as a fidget after printing).</w:t>
@@ -277,9 +271,39 @@
         <w:rPr>
           <w:b/>
         </w:rPr>
+        <w:t xml:space="preserve"> (</w:t>
+      </w:r>
+      <w:r>
+        <w:t>1</w:t>
+      </w:r>
+      <w:r>
+        <w:rPr>
+          <w:vertAlign w:val="superscript"/>
+        </w:rPr>
+        <w:t>st</w:t>
+      </w:r>
+      <w:r>
+        <w:t xml:space="preserve"> part of</w:t>
+      </w:r>
+      <w:r>
+        <w:rPr>
+          <w:b/>
+        </w:rPr>
         <w:t xml:space="preserve"> </w:t>
       </w:r>
       <w:r>
+        <w:rPr>
+          <w:b/>
+        </w:rPr>
+        <w:t>2040_Bot_Connects.stl</w:t>
+      </w:r>
+      <w:r>
+        <w:rPr>
+          <w:b/>
+        </w:rPr>
+        <w:t xml:space="preserve">) </w:t>
+      </w:r>
+      <w:r>
         <w:t>and</w:t>
       </w:r>
       <w:r>
@@ -301,7 +325,13 @@
         <w:t>Heatgun_Center_V2 3D</w:t>
       </w:r>
       <w:r>
-        <w:t xml:space="preserve"> prints.  The Heat gun </w:t>
+        <w:t xml:space="preserve"> prints.  </w:t>
+      </w:r>
+      <w:r>
+        <w:t xml:space="preserve">If you are using a different heat gun than in BOM, this probably will not work for you. </w:t>
+      </w:r>
+      <w:r>
+        <w:t xml:space="preserve">The Heat gun </w:t>
       </w:r>
       <w:r>
         <w:t>center part is not necessary but makes it easy to line up the heat gun if you are using the same heat gun I have listed in BOM.  You need 4-M5x12mm screws with Tee Nuts for the</w:t>
@@ -335,8 +365,8 @@
         </w:rPr>
         <w:drawing>
           <wp:inline distT="0" distB="0" distL="0" distR="0">
-            <wp:extent cx="2438400" cy="1828800"/>
-            <wp:effectExtent l="0" t="0" r="0" b="0"/>
+            <wp:extent cx="2276475" cy="1707356"/>
+            <wp:effectExtent l="0" t="0" r="0" b="7620"/>
             <wp:docPr id="23" name="Picture 23"/>
             <wp:cNvGraphicFramePr>
               <a:graphicFrameLocks xmlns:a="http://schemas.openxmlformats.org/drawingml/2006/main" noChangeAspect="1"/>
@@ -363,7 +393,7 @@
                   <pic:spPr>
                     <a:xfrm>
                       <a:off x="0" y="0"/>
-                      <a:ext cx="2438400" cy="1828800"/>
+                      <a:ext cx="2276475" cy="1707356"/>
                     </a:xfrm>
                     <a:prstGeom prst="rect">
                       <a:avLst/>
@@ -401,7 +431,55 @@
         <w:t>2</w:t>
       </w:r>
       <w:r>
-        <w:t xml:space="preserve"> at each end of the frame with 2-</w:t>
+        <w:t xml:space="preserve"> </w:t>
+      </w:r>
+      <w:r>
+        <w:rPr>
+          <w:b/>
+        </w:rPr>
+        <w:t>(</w:t>
+      </w:r>
+      <w:r>
+        <w:t>2</w:t>
+      </w:r>
+      <w:r>
+        <w:rPr>
+          <w:vertAlign w:val="superscript"/>
+        </w:rPr>
+        <w:t>nd</w:t>
+      </w:r>
+      <w:r>
+        <w:t xml:space="preserve"> </w:t>
+      </w:r>
+      <w:r>
+        <w:t>part of</w:t>
+      </w:r>
+      <w:r>
+        <w:rPr>
+          <w:b/>
+        </w:rPr>
+        <w:t xml:space="preserve"> </w:t>
+      </w:r>
+      <w:r>
+        <w:rPr>
+          <w:b/>
+        </w:rPr>
+        <w:t>2040_Bot_Connects.stl</w:t>
+      </w:r>
+      <w:r>
+        <w:rPr>
+          <w:b/>
+        </w:rPr>
+        <w:t>)</w:t>
+      </w:r>
+      <w:r>
+        <w:rPr>
+          <w:b/>
+        </w:rPr>
+        <w:t xml:space="preserve"> </w:t>
+      </w:r>
+      <w:r>
+        <w:t>at each end of the frame with 2-</w:t>
       </w:r>
       <w:r>
         <w:t>M5x12mm screw</w:t>
@@ -473,6 +551,48 @@
         <w:t>V2020_Column_1</w:t>
       </w:r>
       <w:r>
+        <w:rPr>
+          <w:b/>
+        </w:rPr>
+        <w:t xml:space="preserve"> </w:t>
+      </w:r>
+      <w:r>
+        <w:rPr>
+          <w:b/>
+        </w:rPr>
+        <w:t>(</w:t>
+      </w:r>
+      <w:r>
+        <w:t>1</w:t>
+      </w:r>
+      <w:r>
+        <w:rPr>
+          <w:vertAlign w:val="superscript"/>
+        </w:rPr>
+        <w:t>st</w:t>
+      </w:r>
+      <w:r>
+        <w:t xml:space="preserve"> part of</w:t>
+      </w:r>
+      <w:r>
+        <w:rPr>
+          <w:b/>
+        </w:rPr>
+        <w:t xml:space="preserve"> </w:t>
+      </w:r>
+      <w:r>
+        <w:rPr>
+          <w:b/>
+        </w:rPr>
+        <w:t>2020_CornerColumns.stl</w:t>
+      </w:r>
+      <w:r>
+        <w:rPr>
+          <w:b/>
+        </w:rPr>
+        <w:t>)</w:t>
+      </w:r>
+      <w:r>
         <w:t xml:space="preserve"> to the front corner below where sifter will be using 2-M5x12mm screws.  These columns are slightly different because of print orientation, but essentially any of the 4 can go in any corner.</w:t>
       </w:r>
     </w:p>
@@ -486,8 +606,8 @@
         </w:rPr>
         <w:drawing>
           <wp:inline distT="0" distB="0" distL="0" distR="0" wp14:anchorId="258851B9" wp14:editId="79B3E2BF">
-            <wp:extent cx="2324100" cy="4759247"/>
-            <wp:effectExtent l="0" t="0" r="0" b="3810"/>
+            <wp:extent cx="2209800" cy="4525187"/>
+            <wp:effectExtent l="0" t="0" r="0" b="8890"/>
             <wp:docPr id="13" name="Picture 13"/>
             <wp:cNvGraphicFramePr>
               <a:graphicFrameLocks xmlns:a="http://schemas.openxmlformats.org/drawingml/2006/main" noChangeAspect="1"/>
@@ -514,7 +634,7 @@
                   <pic:spPr>
                     <a:xfrm>
                       <a:off x="0" y="0"/>
-                      <a:ext cx="2325745" cy="4762616"/>
+                      <a:ext cx="2214760" cy="4535344"/>
                     </a:xfrm>
                     <a:prstGeom prst="rect">
                       <a:avLst/>
@@ -542,7 +662,43 @@
         <w:t>V2020_Column_2</w:t>
       </w:r>
       <w:r>
-        <w:t xml:space="preserve"> to opposite short side using 2-M5x12mm screws.</w:t>
+        <w:t xml:space="preserve"> </w:t>
+      </w:r>
+      <w:r>
+        <w:rPr>
+          <w:b/>
+        </w:rPr>
+        <w:t>(</w:t>
+      </w:r>
+      <w:r>
+        <w:t>2nd</w:t>
+      </w:r>
+      <w:r>
+        <w:t xml:space="preserve"> part of</w:t>
+      </w:r>
+      <w:r>
+        <w:rPr>
+          <w:b/>
+        </w:rPr>
+        <w:t xml:space="preserve"> </w:t>
+      </w:r>
+      <w:r>
+        <w:rPr>
+          <w:b/>
+        </w:rPr>
+        <w:t>2020_CornerColumns.stl</w:t>
+      </w:r>
+      <w:r>
+        <w:rPr>
+          <w:b/>
+        </w:rPr>
+        <w:t>)</w:t>
+      </w:r>
+      <w:r>
+        <w:t xml:space="preserve"> </w:t>
+      </w:r>
+      <w:r>
+        <w:t>to opposite short side using 2-M5x12mm screws.</w:t>
       </w:r>
     </w:p>
     <w:p>
@@ -667,10 +823,34 @@
         <w:t xml:space="preserve">Assemble </w:t>
       </w:r>
       <w:r>
+        <w:rPr>
+          <w:b/>
+        </w:rPr>
         <w:t>CenterColumn_1</w:t>
       </w:r>
       <w:r>
-        <w:t xml:space="preserve"> and CenterColumn_2 to the bottom frame using a total of 4-M5x12mm screws as shown.  They do not necessarily have to go in the middle.  I have the back one in the middle for grabbing the center to dump roasted beans, but the front one I have closer to electronics to fasten MAX6675 and wire tie motor wire.</w:t>
+        <w:rPr>
+          <w:b/>
+        </w:rPr>
+        <w:t>.stl</w:t>
+      </w:r>
+      <w:r>
+        <w:t xml:space="preserve"> and </w:t>
+      </w:r>
+      <w:r>
+        <w:rPr>
+          <w:b/>
+        </w:rPr>
+        <w:t>CenterColumn_2</w:t>
+      </w:r>
+      <w:r>
+        <w:rPr>
+          <w:b/>
+        </w:rPr>
+        <w:t>.stl</w:t>
+      </w:r>
+      <w:r>
+        <w:t xml:space="preserve"> to the bottom frame using a total of 4-M5x12mm screws as shown.  They do not necessarily have to go in the middle.  I have the back one in the middle for grabbing the center to dump roasted beans, but the front one I have closer to electronics to fasten MAX6675 and wire tie motor wire.</w:t>
       </w:r>
     </w:p>
     <w:p>
@@ -836,7 +1016,62 @@
     </w:p>
     <w:p>
       <w:r>
-        <w:t>Attach Bearing_Column_1 and Bearing_Column_2 to the end of the 2040x500mm top frames and the short 2040x140mm extrusion as shown.  Make sure you have a Tee Nut as shown in the middle of short 2040.  It does not have to be centered yet.  Use 8-M5x12mm screws with Tee Nuts in the extrusions to connect these.</w:t>
+        <w:t xml:space="preserve">Attach </w:t>
+      </w:r>
+      <w:r>
+        <w:rPr>
+          <w:b/>
+        </w:rPr>
+        <w:t>Bearing_Column_1</w:t>
+      </w:r>
+      <w:r>
+        <w:rPr>
+          <w:b/>
+        </w:rPr>
+        <w:t>.stl</w:t>
+      </w:r>
+      <w:r>
+        <w:t xml:space="preserve"> and </w:t>
+      </w:r>
+      <w:r>
+        <w:rPr>
+          <w:b/>
+        </w:rPr>
+        <w:t>Bearing_Column_2</w:t>
+      </w:r>
+      <w:r>
+        <w:rPr>
+          <w:b/>
+        </w:rPr>
+        <w:t>.stl</w:t>
+      </w:r>
+      <w:r>
+        <w:t xml:space="preserve"> </w:t>
+      </w:r>
+      <w:r>
+        <w:t xml:space="preserve">(from </w:t>
+      </w:r>
+      <w:proofErr w:type="spellStart"/>
+      <w:proofErr w:type="gramStart"/>
+      <w:r>
+        <w:rPr>
+          <w:b/>
+        </w:rPr>
+        <w:t>BearingColumns.stl</w:t>
+      </w:r>
+      <w:proofErr w:type="spellEnd"/>
+      <w:r>
+        <w:t xml:space="preserve"> </w:t>
+      </w:r>
+      <w:r>
+        <w:t>)</w:t>
+      </w:r>
+      <w:proofErr w:type="gramEnd"/>
+      <w:r>
+        <w:t xml:space="preserve"> </w:t>
+      </w:r>
+      <w:r>
+        <w:t>to the end of the 2040x500mm top frames and the short 2040x140mm extrusion as shown.  Make sure you have a Tee Nut as shown in the middle of short 2040.  It does not have to be centered yet.  Use 8-M5x12mm screws with Tee Nuts in the extrusions to connect these.</w:t>
       </w:r>
     </w:p>
     <w:p>
@@ -900,9 +1135,40 @@
         </w:rPr>
         <w:t>BearingBar</w:t>
       </w:r>
+      <w:r>
+        <w:rPr>
+          <w:b/>
+        </w:rPr>
+        <w:t>.stl</w:t>
+      </w:r>
       <w:proofErr w:type="spellEnd"/>
       <w:r>
-        <w:t xml:space="preserve"> 3D print and insert a </w:t>
+        <w:t xml:space="preserve"> </w:t>
+      </w:r>
+      <w:r>
+        <w:t xml:space="preserve">(from </w:t>
+      </w:r>
+      <w:proofErr w:type="spellStart"/>
+      <w:proofErr w:type="gramStart"/>
+      <w:r>
+        <w:rPr>
+          <w:b/>
+        </w:rPr>
+        <w:t>BearingColumns.stl</w:t>
+      </w:r>
+      <w:proofErr w:type="spellEnd"/>
+      <w:r>
+        <w:t xml:space="preserve"> </w:t>
+      </w:r>
+      <w:r>
+        <w:t>)</w:t>
+      </w:r>
+      <w:proofErr w:type="gramEnd"/>
+      <w:r>
+        <w:t xml:space="preserve"> </w:t>
+      </w:r>
+      <w:r>
+        <w:t xml:space="preserve">3D print and insert a </w:t>
       </w:r>
       <w:r>
         <w:t>625-2RS</w:t>
@@ -1107,6 +1373,12 @@
         <w:t>V2040x240_End_Plates</w:t>
       </w:r>
       <w:r>
+        <w:rPr>
+          <w:b/>
+        </w:rPr>
+        <w:t>.stl</w:t>
+      </w:r>
+      <w:r>
         <w:t xml:space="preserve"> to the other sh</w:t>
       </w:r>
       <w:r>
@@ -1179,7 +1451,16 @@
         <w:t>ShortV_Connect_V3</w:t>
       </w:r>
       <w:r>
+        <w:rPr>
+          <w:b/>
+        </w:rPr>
+        <w:t>.stl</w:t>
+      </w:r>
+      <w:r>
         <w:t xml:space="preserve"> before putting the end piece on.  This is used for connecting the Electronics case to the extrusion.</w:t>
+      </w:r>
+      <w:r>
+        <w:t xml:space="preserve">  If you are putting together the Arduino UNO case I made, you may want to attach the case and LCD case to this before attaching to the 2040 extrusion.</w:t>
       </w:r>
     </w:p>
     <w:p>
@@ -1239,6 +1520,12 @@
           <w:b/>
         </w:rPr>
         <w:t>V2020x140_Mod</w:t>
+      </w:r>
+      <w:r>
+        <w:rPr>
+          <w:b/>
+        </w:rPr>
+        <w:t>.stl</w:t>
       </w:r>
       <w:r>
         <w:t xml:space="preserve"> 3D print.  You could also use a 2020x140mm length of extrusion, but this uses only 1 Tee Nut on each side and you do not have any grooves for chaff to get in.</w:t>
@@ -1720,7 +2007,193 @@
           <w:sz w:val="24"/>
           <w:szCs w:val="24"/>
         </w:rPr>
-        <w:t xml:space="preserve">Insert a M4 tap bolt through the bottom of the </w:t>
+        <w:t>Insert a M4</w:t>
+      </w:r>
+      <w:r>
+        <w:rPr>
+          <w:sz w:val="24"/>
+          <w:szCs w:val="24"/>
+        </w:rPr>
+        <w:t>x25mm</w:t>
+      </w:r>
+      <w:r>
+        <w:rPr>
+          <w:sz w:val="24"/>
+          <w:szCs w:val="24"/>
+        </w:rPr>
+        <w:t xml:space="preserve"> tap bolt through the bottom of the </w:t>
+      </w:r>
+      <w:r>
+        <w:rPr>
+          <w:b/>
+          <w:sz w:val="24"/>
+          <w:szCs w:val="24"/>
+        </w:rPr>
+        <w:t>PlanetDrive_5_1_Rev35.stl</w:t>
+      </w:r>
+      <w:r>
+        <w:rPr>
+          <w:sz w:val="24"/>
+          <w:szCs w:val="24"/>
+        </w:rPr>
+        <w:t xml:space="preserve"> shown in white, </w:t>
+      </w:r>
+      <w:r>
+        <w:rPr>
+          <w:sz w:val="24"/>
+          <w:szCs w:val="24"/>
+        </w:rPr>
+        <w:t>Tighten M4 Locknut down on top of Planet drive</w:t>
+      </w:r>
+      <w:r>
+        <w:rPr>
+          <w:sz w:val="24"/>
+          <w:szCs w:val="24"/>
+        </w:rPr>
+        <w:t xml:space="preserve"> and </w:t>
+      </w:r>
+      <w:r>
+        <w:rPr>
+          <w:sz w:val="24"/>
+          <w:szCs w:val="24"/>
+        </w:rPr>
+        <w:t>add a lock</w:t>
+      </w:r>
+      <w:r>
+        <w:rPr>
+          <w:sz w:val="24"/>
+          <w:szCs w:val="24"/>
+        </w:rPr>
+        <w:t xml:space="preserve"> </w:t>
+      </w:r>
+      <w:r>
+        <w:rPr>
+          <w:sz w:val="24"/>
+          <w:szCs w:val="24"/>
+        </w:rPr>
+        <w:t xml:space="preserve">washer on top </w:t>
+      </w:r>
+      <w:r>
+        <w:rPr>
+          <w:sz w:val="24"/>
+          <w:szCs w:val="24"/>
+        </w:rPr>
+        <w:t>then thread the brass hex coupler down tight.</w:t>
+      </w:r>
+    </w:p>
+    <w:p>
+      <w:pPr>
+        <w:spacing w:after="0"/>
+        <w:rPr>
+          <w:sz w:val="24"/>
+          <w:szCs w:val="24"/>
+        </w:rPr>
+      </w:pPr>
+      <w:r>
+        <w:rPr>
+          <w:sz w:val="24"/>
+          <w:szCs w:val="24"/>
+        </w:rPr>
+        <w:t>Insert the other M4</w:t>
+      </w:r>
+      <w:r>
+        <w:rPr>
+          <w:sz w:val="24"/>
+          <w:szCs w:val="24"/>
+        </w:rPr>
+        <w:t>x25mm</w:t>
+      </w:r>
+      <w:r>
+        <w:rPr>
+          <w:sz w:val="24"/>
+          <w:szCs w:val="24"/>
+        </w:rPr>
+        <w:t xml:space="preserve"> tap bolt through the top of the sun shown in yellow</w:t>
+      </w:r>
+      <w:r>
+        <w:rPr>
+          <w:sz w:val="24"/>
+          <w:szCs w:val="24"/>
+        </w:rPr>
+        <w:t>.  Before adding all that hardware, we want to add all the planet bearings as it will be easier.</w:t>
+      </w:r>
+      <w:r>
+        <w:rPr>
+          <w:sz w:val="24"/>
+          <w:szCs w:val="24"/>
+        </w:rPr>
+        <w:t xml:space="preserve">  Add the 3 – M5x35</w:t>
+      </w:r>
+      <w:r>
+        <w:rPr>
+          <w:sz w:val="24"/>
+          <w:szCs w:val="24"/>
+        </w:rPr>
+        <w:t>mm screws</w:t>
+      </w:r>
+      <w:r>
+        <w:rPr>
+          <w:sz w:val="24"/>
+          <w:szCs w:val="24"/>
+        </w:rPr>
+        <w:t xml:space="preserve"> (30mm length might work)</w:t>
+      </w:r>
+      <w:r>
+        <w:rPr>
+          <w:sz w:val="24"/>
+          <w:szCs w:val="24"/>
+        </w:rPr>
+        <w:t xml:space="preserve"> through the bottom of each planet.  While holding them in place with your fingers, place this gear system on a flat surface.  Put a </w:t>
+      </w:r>
+      <w:r>
+        <w:rPr>
+          <w:sz w:val="24"/>
+          <w:szCs w:val="24"/>
+        </w:rPr>
+        <w:t>625-2RS</w:t>
+      </w:r>
+      <w:r>
+        <w:rPr>
+          <w:sz w:val="24"/>
+          <w:szCs w:val="24"/>
+        </w:rPr>
+        <w:t xml:space="preserve"> inside the top of each planet followed by M5 shim washer and bearing.  </w:t>
+      </w:r>
+      <w:r>
+        <w:rPr>
+          <w:sz w:val="24"/>
+          <w:szCs w:val="24"/>
+        </w:rPr>
+        <w:t xml:space="preserve">I included </w:t>
+      </w:r>
+      <w:r>
+        <w:rPr>
+          <w:b/>
+          <w:sz w:val="24"/>
+          <w:szCs w:val="24"/>
+        </w:rPr>
+        <w:t>M5_Bearing_Shims.stl</w:t>
+      </w:r>
+      <w:r>
+        <w:rPr>
+          <w:sz w:val="24"/>
+          <w:szCs w:val="24"/>
+        </w:rPr>
+        <w:t xml:space="preserve"> </w:t>
+      </w:r>
+      <w:r>
+        <w:rPr>
+          <w:sz w:val="24"/>
+          <w:szCs w:val="24"/>
+        </w:rPr>
+        <w:t xml:space="preserve">you can probably use in place of the M5 shim washers. </w:t>
+      </w:r>
+      <w:r>
+        <w:rPr>
+          <w:sz w:val="24"/>
+          <w:szCs w:val="24"/>
+        </w:rPr>
+        <w:t xml:space="preserve">Place the </w:t>
       </w:r>
       <w:r>
         <w:rPr>
@@ -1732,31 +2205,11 @@
       </w:r>
       <w:r>
         <w:rPr>
-          <w:sz w:val="24"/>
-          <w:szCs w:val="24"/>
-        </w:rPr>
-        <w:t xml:space="preserve"> shown in white, </w:t>
-      </w:r>
-      <w:r>
-        <w:rPr>
-          <w:sz w:val="24"/>
-          <w:szCs w:val="24"/>
-        </w:rPr>
-        <w:t>Tighten M4 Locknut down on top of Planet drive</w:t>
-      </w:r>
-      <w:r>
-        <w:rPr>
-          <w:sz w:val="24"/>
-          <w:szCs w:val="24"/>
-        </w:rPr>
-        <w:t xml:space="preserve"> and </w:t>
-      </w:r>
-      <w:r>
-        <w:rPr>
-          <w:sz w:val="24"/>
-          <w:szCs w:val="24"/>
-        </w:rPr>
-        <w:t>add a lock</w:t>
+          <w:b/>
+          <w:sz w:val="24"/>
+          <w:szCs w:val="24"/>
+        </w:rPr>
+        <w:t>.stl</w:t>
       </w:r>
       <w:r>
         <w:rPr>
@@ -1770,73 +2223,7 @@
           <w:sz w:val="24"/>
           <w:szCs w:val="24"/>
         </w:rPr>
-        <w:t xml:space="preserve">washer on top </w:t>
-      </w:r>
-      <w:r>
-        <w:rPr>
-          <w:sz w:val="24"/>
-          <w:szCs w:val="24"/>
-        </w:rPr>
-        <w:t>then thread the brass hex coupler down tight.</w:t>
-      </w:r>
-    </w:p>
-    <w:p>
-      <w:pPr>
-        <w:spacing w:after="0"/>
-        <w:rPr>
-          <w:sz w:val="24"/>
-          <w:szCs w:val="24"/>
-        </w:rPr>
-      </w:pPr>
-      <w:r>
-        <w:rPr>
-          <w:sz w:val="24"/>
-          <w:szCs w:val="24"/>
-        </w:rPr>
-        <w:t>Insert the other M4 tap bolt through the top of the sun shown in yellow</w:t>
-      </w:r>
-      <w:r>
-        <w:rPr>
-          <w:sz w:val="24"/>
-          <w:szCs w:val="24"/>
-        </w:rPr>
-        <w:t>.  Before adding all that hardware, we want to add all the planet bearings as it will be easier.</w:t>
-      </w:r>
-      <w:r>
-        <w:rPr>
-          <w:sz w:val="24"/>
-          <w:szCs w:val="24"/>
-        </w:rPr>
-        <w:t xml:space="preserve">  Add the 3 – M5x30mm screws through the bottom of each planet.  While holding them in place with your fingers, place this gear system on a flat surface.  Put a </w:t>
-      </w:r>
-      <w:r>
-        <w:rPr>
-          <w:sz w:val="24"/>
-          <w:szCs w:val="24"/>
-        </w:rPr>
-        <w:t>625-2RS</w:t>
-      </w:r>
-      <w:r>
-        <w:rPr>
-          <w:sz w:val="24"/>
-          <w:szCs w:val="24"/>
-        </w:rPr>
-        <w:t xml:space="preserve"> inside the top of each planet followed by M5 shim washer and bearing.  Place the </w:t>
-      </w:r>
-      <w:r>
-        <w:rPr>
-          <w:b/>
-          <w:sz w:val="24"/>
-          <w:szCs w:val="24"/>
-        </w:rPr>
-        <w:t>PlanetDrive_5_1_Rev35</w:t>
-      </w:r>
-      <w:r>
-        <w:rPr>
-          <w:sz w:val="24"/>
-          <w:szCs w:val="24"/>
-        </w:rPr>
-        <w:t xml:space="preserve"> on top of the bearings.  </w:t>
+        <w:t xml:space="preserve">on top of the bearings.  </w:t>
       </w:r>
       <w:r>
         <w:t xml:space="preserve">The M5x30mm screws should protrude through the top.  </w:t>
@@ -1921,8 +2308,6 @@
         </w:rPr>
       </w:pPr>
     </w:p>
-    <w:p/>
-    <w:p/>
     <w:p>
       <w:pPr>
         <w:rPr>
@@ -1947,6 +2332,7 @@
           <w:sz w:val="40"/>
           <w:szCs w:val="40"/>
         </w:rPr>
+        <w:lastRenderedPageBreak/>
         <w:t>Nema</w:t>
       </w:r>
       <w:proofErr w:type="spellEnd"/>
@@ -2211,7 +2597,6 @@
           <w:sz w:val="40"/>
           <w:szCs w:val="40"/>
         </w:rPr>
-        <w:lastRenderedPageBreak/>
         <w:t>Wobble Disc Assembly</w:t>
       </w:r>
       <w:r>
@@ -2236,6 +2621,7 @@
           <w:sz w:val="24"/>
           <w:szCs w:val="24"/>
         </w:rPr>
+        <w:lastRenderedPageBreak/>
         <w:t xml:space="preserve">If you cut your own disc out of stainless steel sheet, your hardware will be different.  Whatever method you use, I would recommend 3d printing </w:t>
       </w:r>
       <w:proofErr w:type="spellStart"/>
@@ -2274,7 +2660,37 @@
           <w:sz w:val="24"/>
           <w:szCs w:val="24"/>
         </w:rPr>
-        <w:t>Mine ended up being about 5.14” or 130.175mm.</w:t>
+        <w:t>My disc</w:t>
+      </w:r>
+      <w:r>
+        <w:rPr>
+          <w:sz w:val="24"/>
+          <w:szCs w:val="24"/>
+        </w:rPr>
+        <w:t xml:space="preserve"> ended up</w:t>
+      </w:r>
+      <w:r>
+        <w:rPr>
+          <w:sz w:val="24"/>
+          <w:szCs w:val="24"/>
+        </w:rPr>
+        <w:t xml:space="preserve"> being about 5.14” or 130.175mm which is the size of that .</w:t>
+      </w:r>
+      <w:proofErr w:type="spellStart"/>
+      <w:r>
+        <w:rPr>
+          <w:sz w:val="24"/>
+          <w:szCs w:val="24"/>
+        </w:rPr>
+        <w:t>stl</w:t>
+      </w:r>
+      <w:proofErr w:type="spellEnd"/>
+      <w:r>
+        <w:rPr>
+          <w:sz w:val="24"/>
+          <w:szCs w:val="24"/>
+        </w:rPr>
+        <w:t xml:space="preserve"> file.</w:t>
       </w:r>
     </w:p>
     <w:p>
@@ -2531,6 +2947,26 @@
     </w:p>
     <w:p>
       <w:pPr>
+        <w:spacing w:after="0" w:line="240" w:lineRule="auto"/>
+        <w:rPr>
+          <w:sz w:val="24"/>
+          <w:szCs w:val="24"/>
+        </w:rPr>
+      </w:pPr>
+    </w:p>
+    <w:p>
+      <w:pPr>
+        <w:spacing w:after="0" w:line="240" w:lineRule="auto"/>
+        <w:rPr>
+          <w:sz w:val="24"/>
+          <w:szCs w:val="24"/>
+        </w:rPr>
+      </w:pPr>
+      <w:bookmarkStart w:id="0" w:name="_GoBack"/>
+      <w:bookmarkEnd w:id="0"/>
+    </w:p>
+    <w:p>
+      <w:pPr>
         <w:rPr>
           <w:b/>
           <w:sz w:val="40"/>
@@ -2993,8 +3429,6 @@
           </wp:inline>
         </w:drawing>
       </w:r>
-      <w:bookmarkStart w:id="0" w:name="_GoBack"/>
-      <w:bookmarkEnd w:id="0"/>
     </w:p>
     <w:p>
       <w:pPr>

</xml_diff>